<commit_message>
Updated tests and added error files
</commit_message>
<xml_diff>
--- a/tests/test_files/m11/WA42380/WA42380.docx
+++ b/tests/test_files/m11/WA42380/WA42380.docx
@@ -37,6 +37,9 @@
             <w:r>
               <w:t>Sponsor Confidentiality Statement</w:t>
             </w:r>
+            <w:r>
+              <w:t>:</w:t>
+            </w:r>
           </w:p>
         </w:tc>
         <w:tc>
@@ -135,6 +138,9 @@
             <w:r>
               <w:t>Full Title</w:t>
             </w:r>
+            <w:r>
+              <w:t>:</w:t>
+            </w:r>
           </w:p>
         </w:tc>
         <w:tc>
@@ -166,6 +172,9 @@
             <w:r>
               <w:t>Sponsor Protocol Identifier</w:t>
             </w:r>
+            <w:r>
+              <w:t>:</w:t>
+            </w:r>
           </w:p>
         </w:tc>
         <w:tc>
@@ -202,6 +211,9 @@
             <w:r>
               <w:t>Original Protocol</w:t>
             </w:r>
+            <w:r>
+              <w:t>:</w:t>
+            </w:r>
           </w:p>
         </w:tc>
         <w:tc>
@@ -233,6 +245,9 @@
             <w:r>
               <w:t>Version Number</w:t>
             </w:r>
+            <w:r>
+              <w:t>:</w:t>
+            </w:r>
           </w:p>
         </w:tc>
         <w:tc>
@@ -269,6 +284,9 @@
             <w:r>
               <w:t>Amendment Identifier</w:t>
             </w:r>
+            <w:r>
+              <w:t>:</w:t>
+            </w:r>
           </w:p>
         </w:tc>
         <w:tc>
@@ -300,6 +318,9 @@
             <w:r>
               <w:t>Amendment Scope</w:t>
             </w:r>
+            <w:r>
+              <w:t>:</w:t>
+            </w:r>
           </w:p>
         </w:tc>
         <w:tc>
@@ -334,6 +355,9 @@
             <w:r>
               <w:t>Compound Code(s)</w:t>
             </w:r>
+            <w:r>
+              <w:t>:</w:t>
+            </w:r>
           </w:p>
         </w:tc>
         <w:tc>
@@ -373,6 +397,9 @@
             <w:r>
               <w:t>Trial Phase</w:t>
             </w:r>
+            <w:r>
+              <w:t>:</w:t>
+            </w:r>
           </w:p>
         </w:tc>
         <w:tc>
@@ -409,6 +436,9 @@
             </w:pPr>
             <w:r>
               <w:t>Sponsor Name and Address</w:t>
+            </w:r>
+            <w:r>
+              <w:t>:</w:t>
             </w:r>
           </w:p>
         </w:tc>
@@ -1560,7 +1590,6 @@
           <w:caps w:val="0"/>
           <w:noProof/>
           <w:kern w:val="2"/>
-          <w:lang/>
           <w14:ligatures w14:val="standardContextual"/>
         </w:rPr>
       </w:pPr>
@@ -1587,7 +1616,6 @@
             <w:caps w:val="0"/>
             <w:noProof/>
             <w:kern w:val="2"/>
-            <w:lang/>
             <w14:ligatures w14:val="standardContextual"/>
           </w:rPr>
           <w:tab/>
@@ -1649,7 +1677,6 @@
           <w:rFonts w:asciiTheme="minorHAnsi" w:eastAsiaTheme="minorEastAsia" w:hAnsiTheme="minorHAnsi" w:cstheme="minorBidi"/>
           <w:noProof/>
           <w:kern w:val="2"/>
-          <w:lang/>
           <w14:ligatures w14:val="standardContextual"/>
         </w:rPr>
       </w:pPr>
@@ -1666,7 +1693,6 @@
             <w:rFonts w:asciiTheme="minorHAnsi" w:eastAsiaTheme="minorEastAsia" w:hAnsiTheme="minorHAnsi" w:cstheme="minorBidi"/>
             <w:noProof/>
             <w:kern w:val="2"/>
-            <w:lang/>
             <w14:ligatures w14:val="standardContextual"/>
           </w:rPr>
           <w:tab/>
@@ -1728,7 +1754,6 @@
           <w:rFonts w:asciiTheme="minorHAnsi" w:eastAsiaTheme="minorEastAsia" w:hAnsiTheme="minorHAnsi" w:cstheme="minorBidi"/>
           <w:noProof/>
           <w:kern w:val="2"/>
-          <w:lang/>
           <w14:ligatures w14:val="standardContextual"/>
         </w:rPr>
       </w:pPr>
@@ -1745,7 +1770,6 @@
             <w:rFonts w:asciiTheme="minorHAnsi" w:eastAsiaTheme="minorEastAsia" w:hAnsiTheme="minorHAnsi" w:cstheme="minorBidi"/>
             <w:noProof/>
             <w:kern w:val="2"/>
-            <w:lang/>
             <w14:ligatures w14:val="standardContextual"/>
           </w:rPr>
           <w:tab/>
@@ -1807,7 +1831,6 @@
           <w:rFonts w:asciiTheme="minorHAnsi" w:eastAsiaTheme="minorEastAsia" w:hAnsiTheme="minorHAnsi" w:cstheme="minorBidi"/>
           <w:noProof/>
           <w:kern w:val="2"/>
-          <w:lang/>
           <w14:ligatures w14:val="standardContextual"/>
         </w:rPr>
       </w:pPr>
@@ -1824,7 +1847,6 @@
             <w:rFonts w:asciiTheme="minorHAnsi" w:eastAsiaTheme="minorEastAsia" w:hAnsiTheme="minorHAnsi" w:cstheme="minorBidi"/>
             <w:noProof/>
             <w:kern w:val="2"/>
-            <w:lang/>
             <w14:ligatures w14:val="standardContextual"/>
           </w:rPr>
           <w:tab/>
@@ -1886,7 +1908,6 @@
           <w:rFonts w:asciiTheme="minorHAnsi" w:eastAsiaTheme="minorEastAsia" w:hAnsiTheme="minorHAnsi" w:cstheme="minorBidi"/>
           <w:noProof/>
           <w:kern w:val="2"/>
-          <w:lang/>
           <w14:ligatures w14:val="standardContextual"/>
         </w:rPr>
       </w:pPr>
@@ -1903,7 +1924,6 @@
             <w:rFonts w:asciiTheme="minorHAnsi" w:eastAsiaTheme="minorEastAsia" w:hAnsiTheme="minorHAnsi" w:cstheme="minorBidi"/>
             <w:noProof/>
             <w:kern w:val="2"/>
-            <w:lang/>
             <w14:ligatures w14:val="standardContextual"/>
           </w:rPr>
           <w:tab/>
@@ -1965,7 +1985,6 @@
           <w:rFonts w:asciiTheme="minorHAnsi" w:eastAsiaTheme="minorEastAsia" w:hAnsiTheme="minorHAnsi" w:cstheme="minorBidi"/>
           <w:noProof/>
           <w:kern w:val="2"/>
-          <w:lang/>
           <w14:ligatures w14:val="standardContextual"/>
         </w:rPr>
       </w:pPr>
@@ -1982,7 +2001,6 @@
             <w:rFonts w:asciiTheme="minorHAnsi" w:eastAsiaTheme="minorEastAsia" w:hAnsiTheme="minorHAnsi" w:cstheme="minorBidi"/>
             <w:noProof/>
             <w:kern w:val="2"/>
-            <w:lang/>
             <w14:ligatures w14:val="standardContextual"/>
           </w:rPr>
           <w:tab/>
@@ -2045,7 +2063,6 @@
           <w:caps w:val="0"/>
           <w:noProof/>
           <w:kern w:val="2"/>
-          <w:lang/>
           <w14:ligatures w14:val="standardContextual"/>
         </w:rPr>
       </w:pPr>
@@ -2063,7 +2080,6 @@
             <w:caps w:val="0"/>
             <w:noProof/>
             <w:kern w:val="2"/>
-            <w:lang/>
             <w14:ligatures w14:val="standardContextual"/>
           </w:rPr>
           <w:tab/>
@@ -2125,7 +2141,6 @@
           <w:rFonts w:asciiTheme="minorHAnsi" w:eastAsiaTheme="minorEastAsia" w:hAnsiTheme="minorHAnsi" w:cstheme="minorBidi"/>
           <w:noProof/>
           <w:kern w:val="2"/>
-          <w:lang/>
           <w14:ligatures w14:val="standardContextual"/>
         </w:rPr>
       </w:pPr>
@@ -2142,7 +2157,6 @@
             <w:rFonts w:asciiTheme="minorHAnsi" w:eastAsiaTheme="minorEastAsia" w:hAnsiTheme="minorHAnsi" w:cstheme="minorBidi"/>
             <w:noProof/>
             <w:kern w:val="2"/>
-            <w:lang/>
             <w14:ligatures w14:val="standardContextual"/>
           </w:rPr>
           <w:tab/>
@@ -2204,7 +2218,6 @@
           <w:rFonts w:asciiTheme="minorHAnsi" w:eastAsiaTheme="minorEastAsia" w:hAnsiTheme="minorHAnsi" w:cstheme="minorBidi"/>
           <w:noProof/>
           <w:kern w:val="2"/>
-          <w:lang/>
           <w14:ligatures w14:val="standardContextual"/>
         </w:rPr>
       </w:pPr>
@@ -2221,7 +2234,6 @@
             <w:rFonts w:asciiTheme="minorHAnsi" w:eastAsiaTheme="minorEastAsia" w:hAnsiTheme="minorHAnsi" w:cstheme="minorBidi"/>
             <w:noProof/>
             <w:kern w:val="2"/>
-            <w:lang/>
             <w14:ligatures w14:val="standardContextual"/>
           </w:rPr>
           <w:tab/>
@@ -2283,7 +2295,6 @@
           <w:rFonts w:asciiTheme="minorHAnsi" w:eastAsiaTheme="minorEastAsia" w:hAnsiTheme="minorHAnsi" w:cstheme="minorBidi"/>
           <w:noProof/>
           <w:kern w:val="2"/>
-          <w:lang/>
           <w14:ligatures w14:val="standardContextual"/>
         </w:rPr>
       </w:pPr>
@@ -2300,7 +2311,6 @@
             <w:rFonts w:asciiTheme="minorHAnsi" w:eastAsiaTheme="minorEastAsia" w:hAnsiTheme="minorHAnsi" w:cstheme="minorBidi"/>
             <w:noProof/>
             <w:kern w:val="2"/>
-            <w:lang/>
             <w14:ligatures w14:val="standardContextual"/>
           </w:rPr>
           <w:tab/>
@@ -2362,7 +2372,6 @@
           <w:rFonts w:asciiTheme="minorHAnsi" w:eastAsiaTheme="minorEastAsia" w:hAnsiTheme="minorHAnsi" w:cstheme="minorBidi"/>
           <w:noProof/>
           <w:kern w:val="2"/>
-          <w:lang/>
           <w14:ligatures w14:val="standardContextual"/>
         </w:rPr>
       </w:pPr>
@@ -2379,7 +2388,6 @@
             <w:rFonts w:asciiTheme="minorHAnsi" w:eastAsiaTheme="minorEastAsia" w:hAnsiTheme="minorHAnsi" w:cstheme="minorBidi"/>
             <w:noProof/>
             <w:kern w:val="2"/>
-            <w:lang/>
             <w14:ligatures w14:val="standardContextual"/>
           </w:rPr>
           <w:tab/>
@@ -2441,7 +2449,6 @@
           <w:rFonts w:asciiTheme="minorHAnsi" w:eastAsiaTheme="minorEastAsia" w:hAnsiTheme="minorHAnsi" w:cstheme="minorBidi"/>
           <w:noProof/>
           <w:kern w:val="2"/>
-          <w:lang/>
           <w14:ligatures w14:val="standardContextual"/>
         </w:rPr>
       </w:pPr>
@@ -2458,7 +2465,6 @@
             <w:rFonts w:asciiTheme="minorHAnsi" w:eastAsiaTheme="minorEastAsia" w:hAnsiTheme="minorHAnsi" w:cstheme="minorBidi"/>
             <w:noProof/>
             <w:kern w:val="2"/>
-            <w:lang/>
             <w14:ligatures w14:val="standardContextual"/>
           </w:rPr>
           <w:tab/>
@@ -2521,7 +2527,6 @@
           <w:caps w:val="0"/>
           <w:noProof/>
           <w:kern w:val="2"/>
-          <w:lang/>
           <w14:ligatures w14:val="standardContextual"/>
         </w:rPr>
       </w:pPr>
@@ -2539,7 +2544,6 @@
             <w:caps w:val="0"/>
             <w:noProof/>
             <w:kern w:val="2"/>
-            <w:lang/>
             <w14:ligatures w14:val="standardContextual"/>
           </w:rPr>
           <w:tab/>
@@ -2601,7 +2605,6 @@
           <w:rFonts w:asciiTheme="minorHAnsi" w:eastAsiaTheme="minorEastAsia" w:hAnsiTheme="minorHAnsi" w:cstheme="minorBidi"/>
           <w:noProof/>
           <w:kern w:val="2"/>
-          <w:lang/>
           <w14:ligatures w14:val="standardContextual"/>
         </w:rPr>
       </w:pPr>
@@ -2618,7 +2621,6 @@
             <w:rFonts w:asciiTheme="minorHAnsi" w:eastAsiaTheme="minorEastAsia" w:hAnsiTheme="minorHAnsi" w:cstheme="minorBidi"/>
             <w:noProof/>
             <w:kern w:val="2"/>
-            <w:lang/>
             <w14:ligatures w14:val="standardContextual"/>
           </w:rPr>
           <w:tab/>
@@ -2680,7 +2682,6 @@
           <w:rFonts w:asciiTheme="minorHAnsi" w:eastAsiaTheme="minorEastAsia" w:hAnsiTheme="minorHAnsi" w:cstheme="minorBidi"/>
           <w:noProof/>
           <w:kern w:val="2"/>
-          <w:lang/>
           <w14:ligatures w14:val="standardContextual"/>
         </w:rPr>
       </w:pPr>
@@ -2697,7 +2698,6 @@
             <w:rFonts w:asciiTheme="minorHAnsi" w:eastAsiaTheme="minorEastAsia" w:hAnsiTheme="minorHAnsi" w:cstheme="minorBidi"/>
             <w:noProof/>
             <w:kern w:val="2"/>
-            <w:lang/>
             <w14:ligatures w14:val="standardContextual"/>
           </w:rPr>
           <w:tab/>
@@ -2760,7 +2760,6 @@
           <w:caps w:val="0"/>
           <w:noProof/>
           <w:kern w:val="2"/>
-          <w:lang/>
           <w14:ligatures w14:val="standardContextual"/>
         </w:rPr>
       </w:pPr>
@@ -2778,7 +2777,6 @@
             <w:caps w:val="0"/>
             <w:noProof/>
             <w:kern w:val="2"/>
-            <w:lang/>
             <w14:ligatures w14:val="standardContextual"/>
           </w:rPr>
           <w:tab/>
@@ -2840,7 +2838,6 @@
           <w:rFonts w:asciiTheme="minorHAnsi" w:eastAsiaTheme="minorEastAsia" w:hAnsiTheme="minorHAnsi" w:cstheme="minorBidi"/>
           <w:noProof/>
           <w:kern w:val="2"/>
-          <w:lang/>
           <w14:ligatures w14:val="standardContextual"/>
         </w:rPr>
       </w:pPr>
@@ -2857,7 +2854,6 @@
             <w:rFonts w:asciiTheme="minorHAnsi" w:eastAsiaTheme="minorEastAsia" w:hAnsiTheme="minorHAnsi" w:cstheme="minorBidi"/>
             <w:noProof/>
             <w:kern w:val="2"/>
-            <w:lang/>
             <w14:ligatures w14:val="standardContextual"/>
           </w:rPr>
           <w:tab/>
@@ -2919,7 +2915,6 @@
           <w:rFonts w:asciiTheme="minorHAnsi" w:eastAsiaTheme="minorEastAsia" w:hAnsiTheme="minorHAnsi" w:cstheme="minorBidi"/>
           <w:noProof/>
           <w:kern w:val="2"/>
-          <w:lang/>
           <w14:ligatures w14:val="standardContextual"/>
         </w:rPr>
       </w:pPr>
@@ -2936,7 +2931,6 @@
             <w:rFonts w:asciiTheme="minorHAnsi" w:eastAsiaTheme="minorEastAsia" w:hAnsiTheme="minorHAnsi" w:cstheme="minorBidi"/>
             <w:noProof/>
             <w:kern w:val="2"/>
-            <w:lang/>
             <w14:ligatures w14:val="standardContextual"/>
           </w:rPr>
           <w:tab/>
@@ -2998,7 +2992,6 @@
           <w:rFonts w:asciiTheme="minorHAnsi" w:eastAsiaTheme="minorEastAsia" w:hAnsiTheme="minorHAnsi" w:cstheme="minorBidi"/>
           <w:noProof/>
           <w:kern w:val="2"/>
-          <w:lang/>
           <w14:ligatures w14:val="standardContextual"/>
         </w:rPr>
       </w:pPr>
@@ -3015,7 +3008,6 @@
             <w:rFonts w:asciiTheme="minorHAnsi" w:eastAsiaTheme="minorEastAsia" w:hAnsiTheme="minorHAnsi" w:cstheme="minorBidi"/>
             <w:noProof/>
             <w:kern w:val="2"/>
-            <w:lang/>
             <w14:ligatures w14:val="standardContextual"/>
           </w:rPr>
           <w:tab/>
@@ -3077,7 +3069,6 @@
           <w:rFonts w:asciiTheme="minorHAnsi" w:eastAsiaTheme="minorEastAsia" w:hAnsiTheme="minorHAnsi" w:cstheme="minorBidi"/>
           <w:noProof/>
           <w:kern w:val="2"/>
-          <w:lang/>
           <w14:ligatures w14:val="standardContextual"/>
         </w:rPr>
       </w:pPr>
@@ -3094,7 +3085,6 @@
             <w:rFonts w:asciiTheme="minorHAnsi" w:eastAsiaTheme="minorEastAsia" w:hAnsiTheme="minorHAnsi" w:cstheme="minorBidi"/>
             <w:noProof/>
             <w:kern w:val="2"/>
-            <w:lang/>
             <w14:ligatures w14:val="standardContextual"/>
           </w:rPr>
           <w:tab/>
@@ -3156,7 +3146,6 @@
           <w:rFonts w:asciiTheme="minorHAnsi" w:eastAsiaTheme="minorEastAsia" w:hAnsiTheme="minorHAnsi" w:cstheme="minorBidi"/>
           <w:noProof/>
           <w:kern w:val="2"/>
-          <w:lang/>
           <w14:ligatures w14:val="standardContextual"/>
         </w:rPr>
       </w:pPr>
@@ -3173,7 +3162,6 @@
             <w:rFonts w:asciiTheme="minorHAnsi" w:eastAsiaTheme="minorEastAsia" w:hAnsiTheme="minorHAnsi" w:cstheme="minorBidi"/>
             <w:noProof/>
             <w:kern w:val="2"/>
-            <w:lang/>
             <w14:ligatures w14:val="standardContextual"/>
           </w:rPr>
           <w:tab/>
@@ -3235,7 +3223,6 @@
           <w:rFonts w:asciiTheme="minorHAnsi" w:eastAsiaTheme="minorEastAsia" w:hAnsiTheme="minorHAnsi" w:cstheme="minorBidi"/>
           <w:noProof/>
           <w:kern w:val="2"/>
-          <w:lang/>
           <w14:ligatures w14:val="standardContextual"/>
         </w:rPr>
       </w:pPr>
@@ -3252,7 +3239,6 @@
             <w:rFonts w:asciiTheme="minorHAnsi" w:eastAsiaTheme="minorEastAsia" w:hAnsiTheme="minorHAnsi" w:cstheme="minorBidi"/>
             <w:noProof/>
             <w:kern w:val="2"/>
-            <w:lang/>
             <w14:ligatures w14:val="standardContextual"/>
           </w:rPr>
           <w:tab/>
@@ -3314,7 +3300,6 @@
           <w:rFonts w:asciiTheme="minorHAnsi" w:eastAsiaTheme="minorEastAsia" w:hAnsiTheme="minorHAnsi" w:cstheme="minorBidi"/>
           <w:noProof/>
           <w:kern w:val="2"/>
-          <w:lang/>
           <w14:ligatures w14:val="standardContextual"/>
         </w:rPr>
       </w:pPr>
@@ -3331,7 +3316,6 @@
             <w:rFonts w:asciiTheme="minorHAnsi" w:eastAsiaTheme="minorEastAsia" w:hAnsiTheme="minorHAnsi" w:cstheme="minorBidi"/>
             <w:noProof/>
             <w:kern w:val="2"/>
-            <w:lang/>
             <w14:ligatures w14:val="standardContextual"/>
           </w:rPr>
           <w:tab/>
@@ -3393,7 +3377,6 @@
           <w:rFonts w:asciiTheme="minorHAnsi" w:eastAsiaTheme="minorEastAsia" w:hAnsiTheme="minorHAnsi" w:cstheme="minorBidi"/>
           <w:noProof/>
           <w:kern w:val="2"/>
-          <w:lang/>
           <w14:ligatures w14:val="standardContextual"/>
         </w:rPr>
       </w:pPr>
@@ -3410,7 +3393,6 @@
             <w:rFonts w:asciiTheme="minorHAnsi" w:eastAsiaTheme="minorEastAsia" w:hAnsiTheme="minorHAnsi" w:cstheme="minorBidi"/>
             <w:noProof/>
             <w:kern w:val="2"/>
-            <w:lang/>
             <w14:ligatures w14:val="standardContextual"/>
           </w:rPr>
           <w:tab/>
@@ -3472,7 +3454,6 @@
           <w:rFonts w:asciiTheme="minorHAnsi" w:eastAsiaTheme="minorEastAsia" w:hAnsiTheme="minorHAnsi" w:cstheme="minorBidi"/>
           <w:noProof/>
           <w:kern w:val="2"/>
-          <w:lang/>
           <w14:ligatures w14:val="standardContextual"/>
         </w:rPr>
       </w:pPr>
@@ -3489,7 +3470,6 @@
             <w:rFonts w:asciiTheme="minorHAnsi" w:eastAsiaTheme="minorEastAsia" w:hAnsiTheme="minorHAnsi" w:cstheme="minorBidi"/>
             <w:noProof/>
             <w:kern w:val="2"/>
-            <w:lang/>
             <w14:ligatures w14:val="standardContextual"/>
           </w:rPr>
           <w:tab/>
@@ -3551,7 +3531,6 @@
           <w:rFonts w:asciiTheme="minorHAnsi" w:eastAsiaTheme="minorEastAsia" w:hAnsiTheme="minorHAnsi" w:cstheme="minorBidi"/>
           <w:noProof/>
           <w:kern w:val="2"/>
-          <w:lang/>
           <w14:ligatures w14:val="standardContextual"/>
         </w:rPr>
       </w:pPr>
@@ -3568,7 +3547,6 @@
             <w:rFonts w:asciiTheme="minorHAnsi" w:eastAsiaTheme="minorEastAsia" w:hAnsiTheme="minorHAnsi" w:cstheme="minorBidi"/>
             <w:noProof/>
             <w:kern w:val="2"/>
-            <w:lang/>
             <w14:ligatures w14:val="standardContextual"/>
           </w:rPr>
           <w:tab/>
@@ -3630,7 +3608,6 @@
           <w:rFonts w:asciiTheme="minorHAnsi" w:eastAsiaTheme="minorEastAsia" w:hAnsiTheme="minorHAnsi" w:cstheme="minorBidi"/>
           <w:noProof/>
           <w:kern w:val="2"/>
-          <w:lang/>
           <w14:ligatures w14:val="standardContextual"/>
         </w:rPr>
       </w:pPr>
@@ -3647,7 +3624,6 @@
             <w:rFonts w:asciiTheme="minorHAnsi" w:eastAsiaTheme="minorEastAsia" w:hAnsiTheme="minorHAnsi" w:cstheme="minorBidi"/>
             <w:noProof/>
             <w:kern w:val="2"/>
-            <w:lang/>
             <w14:ligatures w14:val="standardContextual"/>
           </w:rPr>
           <w:tab/>
@@ -3709,7 +3685,6 @@
           <w:rFonts w:asciiTheme="minorHAnsi" w:eastAsiaTheme="minorEastAsia" w:hAnsiTheme="minorHAnsi" w:cstheme="minorBidi"/>
           <w:noProof/>
           <w:kern w:val="2"/>
-          <w:lang/>
           <w14:ligatures w14:val="standardContextual"/>
         </w:rPr>
       </w:pPr>
@@ -3726,7 +3701,6 @@
             <w:rFonts w:asciiTheme="minorHAnsi" w:eastAsiaTheme="minorEastAsia" w:hAnsiTheme="minorHAnsi" w:cstheme="minorBidi"/>
             <w:noProof/>
             <w:kern w:val="2"/>
-            <w:lang/>
             <w14:ligatures w14:val="standardContextual"/>
           </w:rPr>
           <w:tab/>
@@ -3788,7 +3762,6 @@
           <w:rFonts w:asciiTheme="minorHAnsi" w:eastAsiaTheme="minorEastAsia" w:hAnsiTheme="minorHAnsi" w:cstheme="minorBidi"/>
           <w:noProof/>
           <w:kern w:val="2"/>
-          <w:lang/>
           <w14:ligatures w14:val="standardContextual"/>
         </w:rPr>
       </w:pPr>
@@ -3805,7 +3778,6 @@
             <w:rFonts w:asciiTheme="minorHAnsi" w:eastAsiaTheme="minorEastAsia" w:hAnsiTheme="minorHAnsi" w:cstheme="minorBidi"/>
             <w:noProof/>
             <w:kern w:val="2"/>
-            <w:lang/>
             <w14:ligatures w14:val="standardContextual"/>
           </w:rPr>
           <w:tab/>
@@ -3868,7 +3840,6 @@
           <w:caps w:val="0"/>
           <w:noProof/>
           <w:kern w:val="2"/>
-          <w:lang/>
           <w14:ligatures w14:val="standardContextual"/>
         </w:rPr>
       </w:pPr>
@@ -3886,7 +3857,6 @@
             <w:caps w:val="0"/>
             <w:noProof/>
             <w:kern w:val="2"/>
-            <w:lang/>
             <w14:ligatures w14:val="standardContextual"/>
           </w:rPr>
           <w:tab/>
@@ -3948,7 +3918,6 @@
           <w:rFonts w:asciiTheme="minorHAnsi" w:eastAsiaTheme="minorEastAsia" w:hAnsiTheme="minorHAnsi" w:cstheme="minorBidi"/>
           <w:noProof/>
           <w:kern w:val="2"/>
-          <w:lang/>
           <w14:ligatures w14:val="standardContextual"/>
         </w:rPr>
       </w:pPr>
@@ -3965,7 +3934,6 @@
             <w:rFonts w:asciiTheme="minorHAnsi" w:eastAsiaTheme="minorEastAsia" w:hAnsiTheme="minorHAnsi" w:cstheme="minorBidi"/>
             <w:noProof/>
             <w:kern w:val="2"/>
-            <w:lang/>
             <w14:ligatures w14:val="standardContextual"/>
           </w:rPr>
           <w:tab/>
@@ -4027,7 +3995,6 @@
           <w:rFonts w:asciiTheme="minorHAnsi" w:eastAsiaTheme="minorEastAsia" w:hAnsiTheme="minorHAnsi" w:cstheme="minorBidi"/>
           <w:noProof/>
           <w:kern w:val="2"/>
-          <w:lang/>
           <w14:ligatures w14:val="standardContextual"/>
         </w:rPr>
       </w:pPr>
@@ -4044,7 +4011,6 @@
             <w:rFonts w:asciiTheme="minorHAnsi" w:eastAsiaTheme="minorEastAsia" w:hAnsiTheme="minorHAnsi" w:cstheme="minorBidi"/>
             <w:noProof/>
             <w:kern w:val="2"/>
-            <w:lang/>
             <w14:ligatures w14:val="standardContextual"/>
           </w:rPr>
           <w:tab/>
@@ -4106,7 +4072,6 @@
           <w:rFonts w:asciiTheme="minorHAnsi" w:eastAsiaTheme="minorEastAsia" w:hAnsiTheme="minorHAnsi" w:cstheme="minorBidi"/>
           <w:noProof/>
           <w:kern w:val="2"/>
-          <w:lang/>
           <w14:ligatures w14:val="standardContextual"/>
         </w:rPr>
       </w:pPr>
@@ -4123,7 +4088,6 @@
             <w:rFonts w:asciiTheme="minorHAnsi" w:eastAsiaTheme="minorEastAsia" w:hAnsiTheme="minorHAnsi" w:cstheme="minorBidi"/>
             <w:noProof/>
             <w:kern w:val="2"/>
-            <w:lang/>
             <w14:ligatures w14:val="standardContextual"/>
           </w:rPr>
           <w:tab/>
@@ -4185,7 +4149,6 @@
           <w:rFonts w:asciiTheme="minorHAnsi" w:eastAsiaTheme="minorEastAsia" w:hAnsiTheme="minorHAnsi" w:cstheme="minorBidi"/>
           <w:noProof/>
           <w:kern w:val="2"/>
-          <w:lang/>
           <w14:ligatures w14:val="standardContextual"/>
         </w:rPr>
       </w:pPr>
@@ -4202,7 +4165,6 @@
             <w:rFonts w:asciiTheme="minorHAnsi" w:eastAsiaTheme="minorEastAsia" w:hAnsiTheme="minorHAnsi" w:cstheme="minorBidi"/>
             <w:noProof/>
             <w:kern w:val="2"/>
-            <w:lang/>
             <w14:ligatures w14:val="standardContextual"/>
           </w:rPr>
           <w:tab/>
@@ -4264,7 +4226,6 @@
           <w:rFonts w:asciiTheme="minorHAnsi" w:eastAsiaTheme="minorEastAsia" w:hAnsiTheme="minorHAnsi" w:cstheme="minorBidi"/>
           <w:noProof/>
           <w:kern w:val="2"/>
-          <w:lang/>
           <w14:ligatures w14:val="standardContextual"/>
         </w:rPr>
       </w:pPr>
@@ -4281,7 +4242,6 @@
             <w:rFonts w:asciiTheme="minorHAnsi" w:eastAsiaTheme="minorEastAsia" w:hAnsiTheme="minorHAnsi" w:cstheme="minorBidi"/>
             <w:noProof/>
             <w:kern w:val="2"/>
-            <w:lang/>
             <w14:ligatures w14:val="standardContextual"/>
           </w:rPr>
           <w:tab/>
@@ -4343,7 +4303,6 @@
           <w:rFonts w:asciiTheme="minorHAnsi" w:eastAsiaTheme="minorEastAsia" w:hAnsiTheme="minorHAnsi" w:cstheme="minorBidi"/>
           <w:noProof/>
           <w:kern w:val="2"/>
-          <w:lang/>
           <w14:ligatures w14:val="standardContextual"/>
         </w:rPr>
       </w:pPr>
@@ -4360,7 +4319,6 @@
             <w:rFonts w:asciiTheme="minorHAnsi" w:eastAsiaTheme="minorEastAsia" w:hAnsiTheme="minorHAnsi" w:cstheme="minorBidi"/>
             <w:noProof/>
             <w:kern w:val="2"/>
-            <w:lang/>
             <w14:ligatures w14:val="standardContextual"/>
           </w:rPr>
           <w:tab/>
@@ -4422,7 +4380,6 @@
           <w:rFonts w:asciiTheme="minorHAnsi" w:eastAsiaTheme="minorEastAsia" w:hAnsiTheme="minorHAnsi" w:cstheme="minorBidi"/>
           <w:noProof/>
           <w:kern w:val="2"/>
-          <w:lang/>
           <w14:ligatures w14:val="standardContextual"/>
         </w:rPr>
       </w:pPr>
@@ -4439,7 +4396,6 @@
             <w:rFonts w:asciiTheme="minorHAnsi" w:eastAsiaTheme="minorEastAsia" w:hAnsiTheme="minorHAnsi" w:cstheme="minorBidi"/>
             <w:noProof/>
             <w:kern w:val="2"/>
-            <w:lang/>
             <w14:ligatures w14:val="standardContextual"/>
           </w:rPr>
           <w:tab/>
@@ -4501,7 +4457,6 @@
           <w:rFonts w:asciiTheme="minorHAnsi" w:eastAsiaTheme="minorEastAsia" w:hAnsiTheme="minorHAnsi" w:cstheme="minorBidi"/>
           <w:noProof/>
           <w:kern w:val="2"/>
-          <w:lang/>
           <w14:ligatures w14:val="standardContextual"/>
         </w:rPr>
       </w:pPr>
@@ -4518,7 +4473,6 @@
             <w:rFonts w:asciiTheme="minorHAnsi" w:eastAsiaTheme="minorEastAsia" w:hAnsiTheme="minorHAnsi" w:cstheme="minorBidi"/>
             <w:noProof/>
             <w:kern w:val="2"/>
-            <w:lang/>
             <w14:ligatures w14:val="standardContextual"/>
           </w:rPr>
           <w:tab/>
@@ -4580,7 +4534,6 @@
           <w:rFonts w:asciiTheme="minorHAnsi" w:eastAsiaTheme="minorEastAsia" w:hAnsiTheme="minorHAnsi" w:cstheme="minorBidi"/>
           <w:noProof/>
           <w:kern w:val="2"/>
-          <w:lang/>
           <w14:ligatures w14:val="standardContextual"/>
         </w:rPr>
       </w:pPr>
@@ -4597,7 +4550,6 @@
             <w:rFonts w:asciiTheme="minorHAnsi" w:eastAsiaTheme="minorEastAsia" w:hAnsiTheme="minorHAnsi" w:cstheme="minorBidi"/>
             <w:noProof/>
             <w:kern w:val="2"/>
-            <w:lang/>
             <w14:ligatures w14:val="standardContextual"/>
           </w:rPr>
           <w:tab/>
@@ -4659,7 +4611,6 @@
           <w:rFonts w:asciiTheme="minorHAnsi" w:eastAsiaTheme="minorEastAsia" w:hAnsiTheme="minorHAnsi" w:cstheme="minorBidi"/>
           <w:noProof/>
           <w:kern w:val="2"/>
-          <w:lang/>
           <w14:ligatures w14:val="standardContextual"/>
         </w:rPr>
       </w:pPr>
@@ -4676,7 +4627,6 @@
             <w:rFonts w:asciiTheme="minorHAnsi" w:eastAsiaTheme="minorEastAsia" w:hAnsiTheme="minorHAnsi" w:cstheme="minorBidi"/>
             <w:noProof/>
             <w:kern w:val="2"/>
-            <w:lang/>
             <w14:ligatures w14:val="standardContextual"/>
           </w:rPr>
           <w:tab/>
@@ -4738,7 +4688,6 @@
           <w:rFonts w:asciiTheme="minorHAnsi" w:eastAsiaTheme="minorEastAsia" w:hAnsiTheme="minorHAnsi" w:cstheme="minorBidi"/>
           <w:noProof/>
           <w:kern w:val="2"/>
-          <w:lang/>
           <w14:ligatures w14:val="standardContextual"/>
         </w:rPr>
       </w:pPr>
@@ -4755,7 +4704,6 @@
             <w:rFonts w:asciiTheme="minorHAnsi" w:eastAsiaTheme="minorEastAsia" w:hAnsiTheme="minorHAnsi" w:cstheme="minorBidi"/>
             <w:noProof/>
             <w:kern w:val="2"/>
-            <w:lang/>
             <w14:ligatures w14:val="standardContextual"/>
           </w:rPr>
           <w:tab/>
@@ -4817,7 +4765,6 @@
           <w:rFonts w:asciiTheme="minorHAnsi" w:eastAsiaTheme="minorEastAsia" w:hAnsiTheme="minorHAnsi" w:cstheme="minorBidi"/>
           <w:noProof/>
           <w:kern w:val="2"/>
-          <w:lang/>
           <w14:ligatures w14:val="standardContextual"/>
         </w:rPr>
       </w:pPr>
@@ -4834,7 +4781,6 @@
             <w:rFonts w:asciiTheme="minorHAnsi" w:eastAsiaTheme="minorEastAsia" w:hAnsiTheme="minorHAnsi" w:cstheme="minorBidi"/>
             <w:noProof/>
             <w:kern w:val="2"/>
-            <w:lang/>
             <w14:ligatures w14:val="standardContextual"/>
           </w:rPr>
           <w:tab/>
@@ -4897,7 +4843,6 @@
           <w:caps w:val="0"/>
           <w:noProof/>
           <w:kern w:val="2"/>
-          <w:lang/>
           <w14:ligatures w14:val="standardContextual"/>
         </w:rPr>
       </w:pPr>
@@ -4915,7 +4860,6 @@
             <w:caps w:val="0"/>
             <w:noProof/>
             <w:kern w:val="2"/>
-            <w:lang/>
             <w14:ligatures w14:val="standardContextual"/>
           </w:rPr>
           <w:tab/>
@@ -4977,7 +4921,6 @@
           <w:rFonts w:asciiTheme="minorHAnsi" w:eastAsiaTheme="minorEastAsia" w:hAnsiTheme="minorHAnsi" w:cstheme="minorBidi"/>
           <w:noProof/>
           <w:kern w:val="2"/>
-          <w:lang/>
           <w14:ligatures w14:val="standardContextual"/>
         </w:rPr>
       </w:pPr>
@@ -4994,7 +4937,6 @@
             <w:rFonts w:asciiTheme="minorHAnsi" w:eastAsiaTheme="minorEastAsia" w:hAnsiTheme="minorHAnsi" w:cstheme="minorBidi"/>
             <w:noProof/>
             <w:kern w:val="2"/>
-            <w:lang/>
             <w14:ligatures w14:val="standardContextual"/>
           </w:rPr>
           <w:tab/>
@@ -5056,7 +4998,6 @@
           <w:rFonts w:asciiTheme="minorHAnsi" w:eastAsiaTheme="minorEastAsia" w:hAnsiTheme="minorHAnsi" w:cstheme="minorBidi"/>
           <w:noProof/>
           <w:kern w:val="2"/>
-          <w:lang/>
           <w14:ligatures w14:val="standardContextual"/>
         </w:rPr>
       </w:pPr>
@@ -5073,7 +5014,6 @@
             <w:rFonts w:asciiTheme="minorHAnsi" w:eastAsiaTheme="minorEastAsia" w:hAnsiTheme="minorHAnsi" w:cstheme="minorBidi"/>
             <w:noProof/>
             <w:kern w:val="2"/>
-            <w:lang/>
             <w14:ligatures w14:val="standardContextual"/>
           </w:rPr>
           <w:tab/>
@@ -5135,7 +5075,6 @@
           <w:rFonts w:asciiTheme="minorHAnsi" w:eastAsiaTheme="minorEastAsia" w:hAnsiTheme="minorHAnsi" w:cstheme="minorBidi"/>
           <w:noProof/>
           <w:kern w:val="2"/>
-          <w:lang/>
           <w14:ligatures w14:val="standardContextual"/>
         </w:rPr>
       </w:pPr>
@@ -5152,7 +5091,6 @@
             <w:rFonts w:asciiTheme="minorHAnsi" w:eastAsiaTheme="minorEastAsia" w:hAnsiTheme="minorHAnsi" w:cstheme="minorBidi"/>
             <w:noProof/>
             <w:kern w:val="2"/>
-            <w:lang/>
             <w14:ligatures w14:val="standardContextual"/>
           </w:rPr>
           <w:tab/>
@@ -5214,7 +5152,6 @@
           <w:rFonts w:asciiTheme="minorHAnsi" w:eastAsiaTheme="minorEastAsia" w:hAnsiTheme="minorHAnsi" w:cstheme="minorBidi"/>
           <w:noProof/>
           <w:kern w:val="2"/>
-          <w:lang/>
           <w14:ligatures w14:val="standardContextual"/>
         </w:rPr>
       </w:pPr>
@@ -5231,7 +5168,6 @@
             <w:rFonts w:asciiTheme="minorHAnsi" w:eastAsiaTheme="minorEastAsia" w:hAnsiTheme="minorHAnsi" w:cstheme="minorBidi"/>
             <w:noProof/>
             <w:kern w:val="2"/>
-            <w:lang/>
             <w14:ligatures w14:val="standardContextual"/>
           </w:rPr>
           <w:tab/>
@@ -5293,7 +5229,6 @@
           <w:rFonts w:asciiTheme="minorHAnsi" w:eastAsiaTheme="minorEastAsia" w:hAnsiTheme="minorHAnsi" w:cstheme="minorBidi"/>
           <w:noProof/>
           <w:kern w:val="2"/>
-          <w:lang/>
           <w14:ligatures w14:val="standardContextual"/>
         </w:rPr>
       </w:pPr>
@@ -5310,7 +5245,6 @@
             <w:rFonts w:asciiTheme="minorHAnsi" w:eastAsiaTheme="minorEastAsia" w:hAnsiTheme="minorHAnsi" w:cstheme="minorBidi"/>
             <w:noProof/>
             <w:kern w:val="2"/>
-            <w:lang/>
             <w14:ligatures w14:val="standardContextual"/>
           </w:rPr>
           <w:tab/>
@@ -5372,7 +5306,6 @@
           <w:rFonts w:asciiTheme="minorHAnsi" w:eastAsiaTheme="minorEastAsia" w:hAnsiTheme="minorHAnsi" w:cstheme="minorBidi"/>
           <w:noProof/>
           <w:kern w:val="2"/>
-          <w:lang/>
           <w14:ligatures w14:val="standardContextual"/>
         </w:rPr>
       </w:pPr>
@@ -5389,7 +5322,6 @@
             <w:rFonts w:asciiTheme="minorHAnsi" w:eastAsiaTheme="minorEastAsia" w:hAnsiTheme="minorHAnsi" w:cstheme="minorBidi"/>
             <w:noProof/>
             <w:kern w:val="2"/>
-            <w:lang/>
             <w14:ligatures w14:val="standardContextual"/>
           </w:rPr>
           <w:tab/>
@@ -5451,7 +5383,6 @@
           <w:rFonts w:asciiTheme="minorHAnsi" w:eastAsiaTheme="minorEastAsia" w:hAnsiTheme="minorHAnsi" w:cstheme="minorBidi"/>
           <w:noProof/>
           <w:kern w:val="2"/>
-          <w:lang/>
           <w14:ligatures w14:val="standardContextual"/>
         </w:rPr>
       </w:pPr>
@@ -5468,7 +5399,6 @@
             <w:rFonts w:asciiTheme="minorHAnsi" w:eastAsiaTheme="minorEastAsia" w:hAnsiTheme="minorHAnsi" w:cstheme="minorBidi"/>
             <w:noProof/>
             <w:kern w:val="2"/>
-            <w:lang/>
             <w14:ligatures w14:val="standardContextual"/>
           </w:rPr>
           <w:tab/>
@@ -5530,7 +5460,6 @@
           <w:rFonts w:asciiTheme="minorHAnsi" w:eastAsiaTheme="minorEastAsia" w:hAnsiTheme="minorHAnsi" w:cstheme="minorBidi"/>
           <w:noProof/>
           <w:kern w:val="2"/>
-          <w:lang/>
           <w14:ligatures w14:val="standardContextual"/>
         </w:rPr>
       </w:pPr>
@@ -5547,7 +5476,6 @@
             <w:rFonts w:asciiTheme="minorHAnsi" w:eastAsiaTheme="minorEastAsia" w:hAnsiTheme="minorHAnsi" w:cstheme="minorBidi"/>
             <w:noProof/>
             <w:kern w:val="2"/>
-            <w:lang/>
             <w14:ligatures w14:val="standardContextual"/>
           </w:rPr>
           <w:tab/>
@@ -5609,7 +5537,6 @@
           <w:rFonts w:asciiTheme="minorHAnsi" w:eastAsiaTheme="minorEastAsia" w:hAnsiTheme="minorHAnsi" w:cstheme="minorBidi"/>
           <w:noProof/>
           <w:kern w:val="2"/>
-          <w:lang/>
           <w14:ligatures w14:val="standardContextual"/>
         </w:rPr>
       </w:pPr>
@@ -5626,7 +5553,6 @@
             <w:rFonts w:asciiTheme="minorHAnsi" w:eastAsiaTheme="minorEastAsia" w:hAnsiTheme="minorHAnsi" w:cstheme="minorBidi"/>
             <w:noProof/>
             <w:kern w:val="2"/>
-            <w:lang/>
             <w14:ligatures w14:val="standardContextual"/>
           </w:rPr>
           <w:tab/>
@@ -5688,7 +5614,6 @@
           <w:rFonts w:asciiTheme="minorHAnsi" w:eastAsiaTheme="minorEastAsia" w:hAnsiTheme="minorHAnsi" w:cstheme="minorBidi"/>
           <w:noProof/>
           <w:kern w:val="2"/>
-          <w:lang/>
           <w14:ligatures w14:val="standardContextual"/>
         </w:rPr>
       </w:pPr>
@@ -5705,7 +5630,6 @@
             <w:rFonts w:asciiTheme="minorHAnsi" w:eastAsiaTheme="minorEastAsia" w:hAnsiTheme="minorHAnsi" w:cstheme="minorBidi"/>
             <w:noProof/>
             <w:kern w:val="2"/>
-            <w:lang/>
             <w14:ligatures w14:val="standardContextual"/>
           </w:rPr>
           <w:tab/>
@@ -5767,7 +5691,6 @@
           <w:rFonts w:asciiTheme="minorHAnsi" w:eastAsiaTheme="minorEastAsia" w:hAnsiTheme="minorHAnsi" w:cstheme="minorBidi"/>
           <w:noProof/>
           <w:kern w:val="2"/>
-          <w:lang/>
           <w14:ligatures w14:val="standardContextual"/>
         </w:rPr>
       </w:pPr>
@@ -5784,7 +5707,6 @@
             <w:rFonts w:asciiTheme="minorHAnsi" w:eastAsiaTheme="minorEastAsia" w:hAnsiTheme="minorHAnsi" w:cstheme="minorBidi"/>
             <w:noProof/>
             <w:kern w:val="2"/>
-            <w:lang/>
             <w14:ligatures w14:val="standardContextual"/>
           </w:rPr>
           <w:tab/>
@@ -5846,7 +5768,6 @@
           <w:rFonts w:asciiTheme="minorHAnsi" w:eastAsiaTheme="minorEastAsia" w:hAnsiTheme="minorHAnsi" w:cstheme="minorBidi"/>
           <w:noProof/>
           <w:kern w:val="2"/>
-          <w:lang/>
           <w14:ligatures w14:val="standardContextual"/>
         </w:rPr>
       </w:pPr>
@@ -5863,7 +5784,6 @@
             <w:rFonts w:asciiTheme="minorHAnsi" w:eastAsiaTheme="minorEastAsia" w:hAnsiTheme="minorHAnsi" w:cstheme="minorBidi"/>
             <w:noProof/>
             <w:kern w:val="2"/>
-            <w:lang/>
             <w14:ligatures w14:val="standardContextual"/>
           </w:rPr>
           <w:tab/>
@@ -5925,7 +5845,6 @@
           <w:rFonts w:asciiTheme="minorHAnsi" w:eastAsiaTheme="minorEastAsia" w:hAnsiTheme="minorHAnsi" w:cstheme="minorBidi"/>
           <w:noProof/>
           <w:kern w:val="2"/>
-          <w:lang/>
           <w14:ligatures w14:val="standardContextual"/>
         </w:rPr>
       </w:pPr>
@@ -5942,7 +5861,6 @@
             <w:rFonts w:asciiTheme="minorHAnsi" w:eastAsiaTheme="minorEastAsia" w:hAnsiTheme="minorHAnsi" w:cstheme="minorBidi"/>
             <w:noProof/>
             <w:kern w:val="2"/>
-            <w:lang/>
             <w14:ligatures w14:val="standardContextual"/>
           </w:rPr>
           <w:tab/>
@@ -6004,7 +5922,6 @@
           <w:rFonts w:asciiTheme="minorHAnsi" w:eastAsiaTheme="minorEastAsia" w:hAnsiTheme="minorHAnsi" w:cstheme="minorBidi"/>
           <w:noProof/>
           <w:kern w:val="2"/>
-          <w:lang/>
           <w14:ligatures w14:val="standardContextual"/>
         </w:rPr>
       </w:pPr>
@@ -6021,7 +5938,6 @@
             <w:rFonts w:asciiTheme="minorHAnsi" w:eastAsiaTheme="minorEastAsia" w:hAnsiTheme="minorHAnsi" w:cstheme="minorBidi"/>
             <w:noProof/>
             <w:kern w:val="2"/>
-            <w:lang/>
             <w14:ligatures w14:val="standardContextual"/>
           </w:rPr>
           <w:tab/>
@@ -6083,7 +5999,6 @@
           <w:rFonts w:asciiTheme="minorHAnsi" w:eastAsiaTheme="minorEastAsia" w:hAnsiTheme="minorHAnsi" w:cstheme="minorBidi"/>
           <w:noProof/>
           <w:kern w:val="2"/>
-          <w:lang/>
           <w14:ligatures w14:val="standardContextual"/>
         </w:rPr>
       </w:pPr>
@@ -6100,7 +6015,6 @@
             <w:rFonts w:asciiTheme="minorHAnsi" w:eastAsiaTheme="minorEastAsia" w:hAnsiTheme="minorHAnsi" w:cstheme="minorBidi"/>
             <w:noProof/>
             <w:kern w:val="2"/>
-            <w:lang/>
             <w14:ligatures w14:val="standardContextual"/>
           </w:rPr>
           <w:tab/>
@@ -6162,7 +6076,6 @@
           <w:rFonts w:asciiTheme="minorHAnsi" w:eastAsiaTheme="minorEastAsia" w:hAnsiTheme="minorHAnsi" w:cstheme="minorBidi"/>
           <w:noProof/>
           <w:kern w:val="2"/>
-          <w:lang/>
           <w14:ligatures w14:val="standardContextual"/>
         </w:rPr>
       </w:pPr>
@@ -6179,7 +6092,6 @@
             <w:rFonts w:asciiTheme="minorHAnsi" w:eastAsiaTheme="minorEastAsia" w:hAnsiTheme="minorHAnsi" w:cstheme="minorBidi"/>
             <w:noProof/>
             <w:kern w:val="2"/>
-            <w:lang/>
             <w14:ligatures w14:val="standardContextual"/>
           </w:rPr>
           <w:tab/>
@@ -6241,7 +6153,6 @@
           <w:rFonts w:asciiTheme="minorHAnsi" w:eastAsiaTheme="minorEastAsia" w:hAnsiTheme="minorHAnsi" w:cstheme="minorBidi"/>
           <w:noProof/>
           <w:kern w:val="2"/>
-          <w:lang/>
           <w14:ligatures w14:val="standardContextual"/>
         </w:rPr>
       </w:pPr>
@@ -6258,7 +6169,6 @@
             <w:rFonts w:asciiTheme="minorHAnsi" w:eastAsiaTheme="minorEastAsia" w:hAnsiTheme="minorHAnsi" w:cstheme="minorBidi"/>
             <w:noProof/>
             <w:kern w:val="2"/>
-            <w:lang/>
             <w14:ligatures w14:val="standardContextual"/>
           </w:rPr>
           <w:tab/>
@@ -6320,7 +6230,6 @@
           <w:rFonts w:asciiTheme="minorHAnsi" w:eastAsiaTheme="minorEastAsia" w:hAnsiTheme="minorHAnsi" w:cstheme="minorBidi"/>
           <w:noProof/>
           <w:kern w:val="2"/>
-          <w:lang/>
           <w14:ligatures w14:val="standardContextual"/>
         </w:rPr>
       </w:pPr>
@@ -6337,7 +6246,6 @@
             <w:rFonts w:asciiTheme="minorHAnsi" w:eastAsiaTheme="minorEastAsia" w:hAnsiTheme="minorHAnsi" w:cstheme="minorBidi"/>
             <w:noProof/>
             <w:kern w:val="2"/>
-            <w:lang/>
             <w14:ligatures w14:val="standardContextual"/>
           </w:rPr>
           <w:tab/>
@@ -6399,7 +6307,6 @@
           <w:rFonts w:asciiTheme="minorHAnsi" w:eastAsiaTheme="minorEastAsia" w:hAnsiTheme="minorHAnsi" w:cstheme="minorBidi"/>
           <w:noProof/>
           <w:kern w:val="2"/>
-          <w:lang/>
           <w14:ligatures w14:val="standardContextual"/>
         </w:rPr>
       </w:pPr>
@@ -6416,7 +6323,6 @@
             <w:rFonts w:asciiTheme="minorHAnsi" w:eastAsiaTheme="minorEastAsia" w:hAnsiTheme="minorHAnsi" w:cstheme="minorBidi"/>
             <w:noProof/>
             <w:kern w:val="2"/>
-            <w:lang/>
             <w14:ligatures w14:val="standardContextual"/>
           </w:rPr>
           <w:tab/>
@@ -6478,7 +6384,6 @@
           <w:rFonts w:asciiTheme="minorHAnsi" w:eastAsiaTheme="minorEastAsia" w:hAnsiTheme="minorHAnsi" w:cstheme="minorBidi"/>
           <w:noProof/>
           <w:kern w:val="2"/>
-          <w:lang/>
           <w14:ligatures w14:val="standardContextual"/>
         </w:rPr>
       </w:pPr>
@@ -6495,7 +6400,6 @@
             <w:rFonts w:asciiTheme="minorHAnsi" w:eastAsiaTheme="minorEastAsia" w:hAnsiTheme="minorHAnsi" w:cstheme="minorBidi"/>
             <w:noProof/>
             <w:kern w:val="2"/>
-            <w:lang/>
             <w14:ligatures w14:val="standardContextual"/>
           </w:rPr>
           <w:tab/>
@@ -6557,7 +6461,6 @@
           <w:rFonts w:asciiTheme="minorHAnsi" w:eastAsiaTheme="minorEastAsia" w:hAnsiTheme="minorHAnsi" w:cstheme="minorBidi"/>
           <w:noProof/>
           <w:kern w:val="2"/>
-          <w:lang/>
           <w14:ligatures w14:val="standardContextual"/>
         </w:rPr>
       </w:pPr>
@@ -6574,7 +6477,6 @@
             <w:rFonts w:asciiTheme="minorHAnsi" w:eastAsiaTheme="minorEastAsia" w:hAnsiTheme="minorHAnsi" w:cstheme="minorBidi"/>
             <w:noProof/>
             <w:kern w:val="2"/>
-            <w:lang/>
             <w14:ligatures w14:val="standardContextual"/>
           </w:rPr>
           <w:tab/>
@@ -6636,7 +6538,6 @@
           <w:rFonts w:asciiTheme="minorHAnsi" w:eastAsiaTheme="minorEastAsia" w:hAnsiTheme="minorHAnsi" w:cstheme="minorBidi"/>
           <w:noProof/>
           <w:kern w:val="2"/>
-          <w:lang/>
           <w14:ligatures w14:val="standardContextual"/>
         </w:rPr>
       </w:pPr>
@@ -6653,7 +6554,6 @@
             <w:rFonts w:asciiTheme="minorHAnsi" w:eastAsiaTheme="minorEastAsia" w:hAnsiTheme="minorHAnsi" w:cstheme="minorBidi"/>
             <w:noProof/>
             <w:kern w:val="2"/>
-            <w:lang/>
             <w14:ligatures w14:val="standardContextual"/>
           </w:rPr>
           <w:tab/>
@@ -6715,7 +6615,6 @@
           <w:rFonts w:asciiTheme="minorHAnsi" w:eastAsiaTheme="minorEastAsia" w:hAnsiTheme="minorHAnsi" w:cstheme="minorBidi"/>
           <w:noProof/>
           <w:kern w:val="2"/>
-          <w:lang/>
           <w14:ligatures w14:val="standardContextual"/>
         </w:rPr>
       </w:pPr>
@@ -6732,7 +6631,6 @@
             <w:rFonts w:asciiTheme="minorHAnsi" w:eastAsiaTheme="minorEastAsia" w:hAnsiTheme="minorHAnsi" w:cstheme="minorBidi"/>
             <w:noProof/>
             <w:kern w:val="2"/>
-            <w:lang/>
             <w14:ligatures w14:val="standardContextual"/>
           </w:rPr>
           <w:tab/>
@@ -6795,7 +6693,6 @@
           <w:caps w:val="0"/>
           <w:noProof/>
           <w:kern w:val="2"/>
-          <w:lang/>
           <w14:ligatures w14:val="standardContextual"/>
         </w:rPr>
       </w:pPr>
@@ -6813,7 +6710,6 @@
             <w:caps w:val="0"/>
             <w:noProof/>
             <w:kern w:val="2"/>
-            <w:lang/>
             <w14:ligatures w14:val="standardContextual"/>
           </w:rPr>
           <w:tab/>
@@ -6875,7 +6771,6 @@
           <w:rFonts w:asciiTheme="minorHAnsi" w:eastAsiaTheme="minorEastAsia" w:hAnsiTheme="minorHAnsi" w:cstheme="minorBidi"/>
           <w:noProof/>
           <w:kern w:val="2"/>
-          <w:lang/>
           <w14:ligatures w14:val="standardContextual"/>
         </w:rPr>
       </w:pPr>
@@ -6892,7 +6787,6 @@
             <w:rFonts w:asciiTheme="minorHAnsi" w:eastAsiaTheme="minorEastAsia" w:hAnsiTheme="minorHAnsi" w:cstheme="minorBidi"/>
             <w:noProof/>
             <w:kern w:val="2"/>
-            <w:lang/>
             <w14:ligatures w14:val="standardContextual"/>
           </w:rPr>
           <w:tab/>
@@ -6954,7 +6848,6 @@
           <w:rFonts w:asciiTheme="minorHAnsi" w:eastAsiaTheme="minorEastAsia" w:hAnsiTheme="minorHAnsi" w:cstheme="minorBidi"/>
           <w:noProof/>
           <w:kern w:val="2"/>
-          <w:lang/>
           <w14:ligatures w14:val="standardContextual"/>
         </w:rPr>
       </w:pPr>
@@ -6971,7 +6864,6 @@
             <w:rFonts w:asciiTheme="minorHAnsi" w:eastAsiaTheme="minorEastAsia" w:hAnsiTheme="minorHAnsi" w:cstheme="minorBidi"/>
             <w:noProof/>
             <w:kern w:val="2"/>
-            <w:lang/>
             <w14:ligatures w14:val="standardContextual"/>
           </w:rPr>
           <w:tab/>
@@ -7033,7 +6925,6 @@
           <w:rFonts w:asciiTheme="minorHAnsi" w:eastAsiaTheme="minorEastAsia" w:hAnsiTheme="minorHAnsi" w:cstheme="minorBidi"/>
           <w:noProof/>
           <w:kern w:val="2"/>
-          <w:lang/>
           <w14:ligatures w14:val="standardContextual"/>
         </w:rPr>
       </w:pPr>
@@ -7050,7 +6941,6 @@
             <w:rFonts w:asciiTheme="minorHAnsi" w:eastAsiaTheme="minorEastAsia" w:hAnsiTheme="minorHAnsi" w:cstheme="minorBidi"/>
             <w:noProof/>
             <w:kern w:val="2"/>
-            <w:lang/>
             <w14:ligatures w14:val="standardContextual"/>
           </w:rPr>
           <w:tab/>
@@ -7112,7 +7002,6 @@
           <w:rFonts w:asciiTheme="minorHAnsi" w:eastAsiaTheme="minorEastAsia" w:hAnsiTheme="minorHAnsi" w:cstheme="minorBidi"/>
           <w:noProof/>
           <w:kern w:val="2"/>
-          <w:lang/>
           <w14:ligatures w14:val="standardContextual"/>
         </w:rPr>
       </w:pPr>
@@ -7129,7 +7018,6 @@
             <w:rFonts w:asciiTheme="minorHAnsi" w:eastAsiaTheme="minorEastAsia" w:hAnsiTheme="minorHAnsi" w:cstheme="minorBidi"/>
             <w:noProof/>
             <w:kern w:val="2"/>
-            <w:lang/>
             <w14:ligatures w14:val="standardContextual"/>
           </w:rPr>
           <w:tab/>
@@ -7191,7 +7079,6 @@
           <w:rFonts w:asciiTheme="minorHAnsi" w:eastAsiaTheme="minorEastAsia" w:hAnsiTheme="minorHAnsi" w:cstheme="minorBidi"/>
           <w:noProof/>
           <w:kern w:val="2"/>
-          <w:lang/>
           <w14:ligatures w14:val="standardContextual"/>
         </w:rPr>
       </w:pPr>
@@ -7208,7 +7095,6 @@
             <w:rFonts w:asciiTheme="minorHAnsi" w:eastAsiaTheme="minorEastAsia" w:hAnsiTheme="minorHAnsi" w:cstheme="minorBidi"/>
             <w:noProof/>
             <w:kern w:val="2"/>
-            <w:lang/>
             <w14:ligatures w14:val="standardContextual"/>
           </w:rPr>
           <w:tab/>
@@ -7270,7 +7156,6 @@
           <w:rFonts w:asciiTheme="minorHAnsi" w:eastAsiaTheme="minorEastAsia" w:hAnsiTheme="minorHAnsi" w:cstheme="minorBidi"/>
           <w:noProof/>
           <w:kern w:val="2"/>
-          <w:lang/>
           <w14:ligatures w14:val="standardContextual"/>
         </w:rPr>
       </w:pPr>
@@ -7287,7 +7172,6 @@
             <w:rFonts w:asciiTheme="minorHAnsi" w:eastAsiaTheme="minorEastAsia" w:hAnsiTheme="minorHAnsi" w:cstheme="minorBidi"/>
             <w:noProof/>
             <w:kern w:val="2"/>
-            <w:lang/>
             <w14:ligatures w14:val="standardContextual"/>
           </w:rPr>
           <w:tab/>
@@ -7350,7 +7234,6 @@
           <w:caps w:val="0"/>
           <w:noProof/>
           <w:kern w:val="2"/>
-          <w:lang/>
           <w14:ligatures w14:val="standardContextual"/>
         </w:rPr>
       </w:pPr>
@@ -7368,7 +7251,6 @@
             <w:caps w:val="0"/>
             <w:noProof/>
             <w:kern w:val="2"/>
-            <w:lang/>
             <w14:ligatures w14:val="standardContextual"/>
           </w:rPr>
           <w:tab/>
@@ -7430,7 +7312,6 @@
           <w:rFonts w:asciiTheme="minorHAnsi" w:eastAsiaTheme="minorEastAsia" w:hAnsiTheme="minorHAnsi" w:cstheme="minorBidi"/>
           <w:noProof/>
           <w:kern w:val="2"/>
-          <w:lang/>
           <w14:ligatures w14:val="standardContextual"/>
         </w:rPr>
       </w:pPr>
@@ -7447,7 +7328,6 @@
             <w:rFonts w:asciiTheme="minorHAnsi" w:eastAsiaTheme="minorEastAsia" w:hAnsiTheme="minorHAnsi" w:cstheme="minorBidi"/>
             <w:noProof/>
             <w:kern w:val="2"/>
-            <w:lang/>
             <w14:ligatures w14:val="standardContextual"/>
           </w:rPr>
           <w:tab/>
@@ -7509,7 +7389,6 @@
           <w:rFonts w:asciiTheme="minorHAnsi" w:eastAsiaTheme="minorEastAsia" w:hAnsiTheme="minorHAnsi" w:cstheme="minorBidi"/>
           <w:noProof/>
           <w:kern w:val="2"/>
-          <w:lang/>
           <w14:ligatures w14:val="standardContextual"/>
         </w:rPr>
       </w:pPr>
@@ -7526,7 +7405,6 @@
             <w:rFonts w:asciiTheme="minorHAnsi" w:eastAsiaTheme="minorEastAsia" w:hAnsiTheme="minorHAnsi" w:cstheme="minorBidi"/>
             <w:noProof/>
             <w:kern w:val="2"/>
-            <w:lang/>
             <w14:ligatures w14:val="standardContextual"/>
           </w:rPr>
           <w:tab/>
@@ -7588,7 +7466,6 @@
           <w:rFonts w:asciiTheme="minorHAnsi" w:eastAsiaTheme="minorEastAsia" w:hAnsiTheme="minorHAnsi" w:cstheme="minorBidi"/>
           <w:noProof/>
           <w:kern w:val="2"/>
-          <w:lang/>
           <w14:ligatures w14:val="standardContextual"/>
         </w:rPr>
       </w:pPr>
@@ -7605,7 +7482,6 @@
             <w:rFonts w:asciiTheme="minorHAnsi" w:eastAsiaTheme="minorEastAsia" w:hAnsiTheme="minorHAnsi" w:cstheme="minorBidi"/>
             <w:noProof/>
             <w:kern w:val="2"/>
-            <w:lang/>
             <w14:ligatures w14:val="standardContextual"/>
           </w:rPr>
           <w:tab/>
@@ -7667,7 +7543,6 @@
           <w:rFonts w:asciiTheme="minorHAnsi" w:eastAsiaTheme="minorEastAsia" w:hAnsiTheme="minorHAnsi" w:cstheme="minorBidi"/>
           <w:noProof/>
           <w:kern w:val="2"/>
-          <w:lang/>
           <w14:ligatures w14:val="standardContextual"/>
         </w:rPr>
       </w:pPr>
@@ -7684,7 +7559,6 @@
             <w:rFonts w:asciiTheme="minorHAnsi" w:eastAsiaTheme="minorEastAsia" w:hAnsiTheme="minorHAnsi" w:cstheme="minorBidi"/>
             <w:noProof/>
             <w:kern w:val="2"/>
-            <w:lang/>
             <w14:ligatures w14:val="standardContextual"/>
           </w:rPr>
           <w:tab/>
@@ -7746,7 +7620,6 @@
           <w:rFonts w:asciiTheme="minorHAnsi" w:eastAsiaTheme="minorEastAsia" w:hAnsiTheme="minorHAnsi" w:cstheme="minorBidi"/>
           <w:noProof/>
           <w:kern w:val="2"/>
-          <w:lang/>
           <w14:ligatures w14:val="standardContextual"/>
         </w:rPr>
       </w:pPr>
@@ -7763,7 +7636,6 @@
             <w:rFonts w:asciiTheme="minorHAnsi" w:eastAsiaTheme="minorEastAsia" w:hAnsiTheme="minorHAnsi" w:cstheme="minorBidi"/>
             <w:noProof/>
             <w:kern w:val="2"/>
-            <w:lang/>
             <w14:ligatures w14:val="standardContextual"/>
           </w:rPr>
           <w:tab/>
@@ -7825,7 +7697,6 @@
           <w:rFonts w:asciiTheme="minorHAnsi" w:eastAsiaTheme="minorEastAsia" w:hAnsiTheme="minorHAnsi" w:cstheme="minorBidi"/>
           <w:noProof/>
           <w:kern w:val="2"/>
-          <w:lang/>
           <w14:ligatures w14:val="standardContextual"/>
         </w:rPr>
       </w:pPr>
@@ -7842,7 +7713,6 @@
             <w:rFonts w:asciiTheme="minorHAnsi" w:eastAsiaTheme="minorEastAsia" w:hAnsiTheme="minorHAnsi" w:cstheme="minorBidi"/>
             <w:noProof/>
             <w:kern w:val="2"/>
-            <w:lang/>
             <w14:ligatures w14:val="standardContextual"/>
           </w:rPr>
           <w:tab/>
@@ -7904,7 +7774,6 @@
           <w:rFonts w:asciiTheme="minorHAnsi" w:eastAsiaTheme="minorEastAsia" w:hAnsiTheme="minorHAnsi" w:cstheme="minorBidi"/>
           <w:noProof/>
           <w:kern w:val="2"/>
-          <w:lang/>
           <w14:ligatures w14:val="standardContextual"/>
         </w:rPr>
       </w:pPr>
@@ -7921,7 +7790,6 @@
             <w:rFonts w:asciiTheme="minorHAnsi" w:eastAsiaTheme="minorEastAsia" w:hAnsiTheme="minorHAnsi" w:cstheme="minorBidi"/>
             <w:noProof/>
             <w:kern w:val="2"/>
-            <w:lang/>
             <w14:ligatures w14:val="standardContextual"/>
           </w:rPr>
           <w:tab/>
@@ -7983,7 +7851,6 @@
           <w:rFonts w:asciiTheme="minorHAnsi" w:eastAsiaTheme="minorEastAsia" w:hAnsiTheme="minorHAnsi" w:cstheme="minorBidi"/>
           <w:noProof/>
           <w:kern w:val="2"/>
-          <w:lang/>
           <w14:ligatures w14:val="standardContextual"/>
         </w:rPr>
       </w:pPr>
@@ -8000,7 +7867,6 @@
             <w:rFonts w:asciiTheme="minorHAnsi" w:eastAsiaTheme="minorEastAsia" w:hAnsiTheme="minorHAnsi" w:cstheme="minorBidi"/>
             <w:noProof/>
             <w:kern w:val="2"/>
-            <w:lang/>
             <w14:ligatures w14:val="standardContextual"/>
           </w:rPr>
           <w:tab/>
@@ -8062,7 +7928,6 @@
           <w:rFonts w:asciiTheme="minorHAnsi" w:eastAsiaTheme="minorEastAsia" w:hAnsiTheme="minorHAnsi" w:cstheme="minorBidi"/>
           <w:noProof/>
           <w:kern w:val="2"/>
-          <w:lang/>
           <w14:ligatures w14:val="standardContextual"/>
         </w:rPr>
       </w:pPr>
@@ -8079,7 +7944,6 @@
             <w:rFonts w:asciiTheme="minorHAnsi" w:eastAsiaTheme="minorEastAsia" w:hAnsiTheme="minorHAnsi" w:cstheme="minorBidi"/>
             <w:noProof/>
             <w:kern w:val="2"/>
-            <w:lang/>
             <w14:ligatures w14:val="standardContextual"/>
           </w:rPr>
           <w:tab/>
@@ -8141,7 +8005,6 @@
           <w:rFonts w:asciiTheme="minorHAnsi" w:eastAsiaTheme="minorEastAsia" w:hAnsiTheme="minorHAnsi" w:cstheme="minorBidi"/>
           <w:noProof/>
           <w:kern w:val="2"/>
-          <w:lang/>
           <w14:ligatures w14:val="standardContextual"/>
         </w:rPr>
       </w:pPr>
@@ -8158,7 +8021,6 @@
             <w:rFonts w:asciiTheme="minorHAnsi" w:eastAsiaTheme="minorEastAsia" w:hAnsiTheme="minorHAnsi" w:cstheme="minorBidi"/>
             <w:noProof/>
             <w:kern w:val="2"/>
-            <w:lang/>
             <w14:ligatures w14:val="standardContextual"/>
           </w:rPr>
           <w:tab/>
@@ -8220,7 +8082,6 @@
           <w:rFonts w:asciiTheme="minorHAnsi" w:eastAsiaTheme="minorEastAsia" w:hAnsiTheme="minorHAnsi" w:cstheme="minorBidi"/>
           <w:noProof/>
           <w:kern w:val="2"/>
-          <w:lang/>
           <w14:ligatures w14:val="standardContextual"/>
         </w:rPr>
       </w:pPr>
@@ -8237,7 +8098,6 @@
             <w:rFonts w:asciiTheme="minorHAnsi" w:eastAsiaTheme="minorEastAsia" w:hAnsiTheme="minorHAnsi" w:cstheme="minorBidi"/>
             <w:noProof/>
             <w:kern w:val="2"/>
-            <w:lang/>
             <w14:ligatures w14:val="standardContextual"/>
           </w:rPr>
           <w:tab/>
@@ -8299,7 +8159,6 @@
           <w:rFonts w:asciiTheme="minorHAnsi" w:eastAsiaTheme="minorEastAsia" w:hAnsiTheme="minorHAnsi" w:cstheme="minorBidi"/>
           <w:noProof/>
           <w:kern w:val="2"/>
-          <w:lang/>
           <w14:ligatures w14:val="standardContextual"/>
         </w:rPr>
       </w:pPr>
@@ -8316,7 +8175,6 @@
             <w:rFonts w:asciiTheme="minorHAnsi" w:eastAsiaTheme="minorEastAsia" w:hAnsiTheme="minorHAnsi" w:cstheme="minorBidi"/>
             <w:noProof/>
             <w:kern w:val="2"/>
-            <w:lang/>
             <w14:ligatures w14:val="standardContextual"/>
           </w:rPr>
           <w:tab/>
@@ -8378,7 +8236,6 @@
           <w:rFonts w:asciiTheme="minorHAnsi" w:eastAsiaTheme="minorEastAsia" w:hAnsiTheme="minorHAnsi" w:cstheme="minorBidi"/>
           <w:noProof/>
           <w:kern w:val="2"/>
-          <w:lang/>
           <w14:ligatures w14:val="standardContextual"/>
         </w:rPr>
       </w:pPr>
@@ -8395,7 +8252,6 @@
             <w:rFonts w:asciiTheme="minorHAnsi" w:eastAsiaTheme="minorEastAsia" w:hAnsiTheme="minorHAnsi" w:cstheme="minorBidi"/>
             <w:noProof/>
             <w:kern w:val="2"/>
-            <w:lang/>
             <w14:ligatures w14:val="standardContextual"/>
           </w:rPr>
           <w:tab/>
@@ -8457,7 +8313,6 @@
           <w:rFonts w:asciiTheme="minorHAnsi" w:eastAsiaTheme="minorEastAsia" w:hAnsiTheme="minorHAnsi" w:cstheme="minorBidi"/>
           <w:noProof/>
           <w:kern w:val="2"/>
-          <w:lang/>
           <w14:ligatures w14:val="standardContextual"/>
         </w:rPr>
       </w:pPr>
@@ -8474,7 +8329,6 @@
             <w:rFonts w:asciiTheme="minorHAnsi" w:eastAsiaTheme="minorEastAsia" w:hAnsiTheme="minorHAnsi" w:cstheme="minorBidi"/>
             <w:noProof/>
             <w:kern w:val="2"/>
-            <w:lang/>
             <w14:ligatures w14:val="standardContextual"/>
           </w:rPr>
           <w:tab/>
@@ -8536,7 +8390,6 @@
           <w:rFonts w:asciiTheme="minorHAnsi" w:eastAsiaTheme="minorEastAsia" w:hAnsiTheme="minorHAnsi" w:cstheme="minorBidi"/>
           <w:noProof/>
           <w:kern w:val="2"/>
-          <w:lang/>
           <w14:ligatures w14:val="standardContextual"/>
         </w:rPr>
       </w:pPr>
@@ -8553,7 +8406,6 @@
             <w:rFonts w:asciiTheme="minorHAnsi" w:eastAsiaTheme="minorEastAsia" w:hAnsiTheme="minorHAnsi" w:cstheme="minorBidi"/>
             <w:noProof/>
             <w:kern w:val="2"/>
-            <w:lang/>
             <w14:ligatures w14:val="standardContextual"/>
           </w:rPr>
           <w:tab/>
@@ -8615,7 +8467,6 @@
           <w:rFonts w:asciiTheme="minorHAnsi" w:eastAsiaTheme="minorEastAsia" w:hAnsiTheme="minorHAnsi" w:cstheme="minorBidi"/>
           <w:noProof/>
           <w:kern w:val="2"/>
-          <w:lang/>
           <w14:ligatures w14:val="standardContextual"/>
         </w:rPr>
       </w:pPr>
@@ -8632,7 +8483,6 @@
             <w:rFonts w:asciiTheme="minorHAnsi" w:eastAsiaTheme="minorEastAsia" w:hAnsiTheme="minorHAnsi" w:cstheme="minorBidi"/>
             <w:noProof/>
             <w:kern w:val="2"/>
-            <w:lang/>
             <w14:ligatures w14:val="standardContextual"/>
           </w:rPr>
           <w:tab/>
@@ -8694,7 +8544,6 @@
           <w:rFonts w:asciiTheme="minorHAnsi" w:eastAsiaTheme="minorEastAsia" w:hAnsiTheme="minorHAnsi" w:cstheme="minorBidi"/>
           <w:noProof/>
           <w:kern w:val="2"/>
-          <w:lang/>
           <w14:ligatures w14:val="standardContextual"/>
         </w:rPr>
       </w:pPr>
@@ -8711,7 +8560,6 @@
             <w:rFonts w:asciiTheme="minorHAnsi" w:eastAsiaTheme="minorEastAsia" w:hAnsiTheme="minorHAnsi" w:cstheme="minorBidi"/>
             <w:noProof/>
             <w:kern w:val="2"/>
-            <w:lang/>
             <w14:ligatures w14:val="standardContextual"/>
           </w:rPr>
           <w:tab/>
@@ -8774,7 +8622,6 @@
           <w:caps w:val="0"/>
           <w:noProof/>
           <w:kern w:val="2"/>
-          <w:lang/>
           <w14:ligatures w14:val="standardContextual"/>
         </w:rPr>
       </w:pPr>
@@ -8792,7 +8639,6 @@
             <w:caps w:val="0"/>
             <w:noProof/>
             <w:kern w:val="2"/>
-            <w:lang/>
             <w14:ligatures w14:val="standardContextual"/>
           </w:rPr>
           <w:tab/>
@@ -8854,7 +8700,6 @@
           <w:rFonts w:asciiTheme="minorHAnsi" w:eastAsiaTheme="minorEastAsia" w:hAnsiTheme="minorHAnsi" w:cstheme="minorBidi"/>
           <w:noProof/>
           <w:kern w:val="2"/>
-          <w:lang/>
           <w14:ligatures w14:val="standardContextual"/>
         </w:rPr>
       </w:pPr>
@@ -8871,7 +8716,6 @@
             <w:rFonts w:asciiTheme="minorHAnsi" w:eastAsiaTheme="minorEastAsia" w:hAnsiTheme="minorHAnsi" w:cstheme="minorBidi"/>
             <w:noProof/>
             <w:kern w:val="2"/>
-            <w:lang/>
             <w14:ligatures w14:val="standardContextual"/>
           </w:rPr>
           <w:tab/>
@@ -8933,7 +8777,6 @@
           <w:rFonts w:asciiTheme="minorHAnsi" w:eastAsiaTheme="minorEastAsia" w:hAnsiTheme="minorHAnsi" w:cstheme="minorBidi"/>
           <w:noProof/>
           <w:kern w:val="2"/>
-          <w:lang/>
           <w14:ligatures w14:val="standardContextual"/>
         </w:rPr>
       </w:pPr>
@@ -8950,7 +8793,6 @@
             <w:rFonts w:asciiTheme="minorHAnsi" w:eastAsiaTheme="minorEastAsia" w:hAnsiTheme="minorHAnsi" w:cstheme="minorBidi"/>
             <w:noProof/>
             <w:kern w:val="2"/>
-            <w:lang/>
             <w14:ligatures w14:val="standardContextual"/>
           </w:rPr>
           <w:tab/>
@@ -9012,7 +8854,6 @@
           <w:rFonts w:asciiTheme="minorHAnsi" w:eastAsiaTheme="minorEastAsia" w:hAnsiTheme="minorHAnsi" w:cstheme="minorBidi"/>
           <w:noProof/>
           <w:kern w:val="2"/>
-          <w:lang/>
           <w14:ligatures w14:val="standardContextual"/>
         </w:rPr>
       </w:pPr>
@@ -9029,7 +8870,6 @@
             <w:rFonts w:asciiTheme="minorHAnsi" w:eastAsiaTheme="minorEastAsia" w:hAnsiTheme="minorHAnsi" w:cstheme="minorBidi"/>
             <w:noProof/>
             <w:kern w:val="2"/>
-            <w:lang/>
             <w14:ligatures w14:val="standardContextual"/>
           </w:rPr>
           <w:tab/>
@@ -9091,7 +8931,6 @@
           <w:rFonts w:asciiTheme="minorHAnsi" w:eastAsiaTheme="minorEastAsia" w:hAnsiTheme="minorHAnsi" w:cstheme="minorBidi"/>
           <w:noProof/>
           <w:kern w:val="2"/>
-          <w:lang/>
           <w14:ligatures w14:val="standardContextual"/>
         </w:rPr>
       </w:pPr>
@@ -9108,7 +8947,6 @@
             <w:rFonts w:asciiTheme="minorHAnsi" w:eastAsiaTheme="minorEastAsia" w:hAnsiTheme="minorHAnsi" w:cstheme="minorBidi"/>
             <w:noProof/>
             <w:kern w:val="2"/>
-            <w:lang/>
             <w14:ligatures w14:val="standardContextual"/>
           </w:rPr>
           <w:tab/>
@@ -9170,7 +9008,6 @@
           <w:rFonts w:asciiTheme="minorHAnsi" w:eastAsiaTheme="minorEastAsia" w:hAnsiTheme="minorHAnsi" w:cstheme="minorBidi"/>
           <w:noProof/>
           <w:kern w:val="2"/>
-          <w:lang/>
           <w14:ligatures w14:val="standardContextual"/>
         </w:rPr>
       </w:pPr>
@@ -9187,7 +9024,6 @@
             <w:rFonts w:asciiTheme="minorHAnsi" w:eastAsiaTheme="minorEastAsia" w:hAnsiTheme="minorHAnsi" w:cstheme="minorBidi"/>
             <w:noProof/>
             <w:kern w:val="2"/>
-            <w:lang/>
             <w14:ligatures w14:val="standardContextual"/>
           </w:rPr>
           <w:tab/>
@@ -9249,7 +9085,6 @@
           <w:rFonts w:asciiTheme="minorHAnsi" w:eastAsiaTheme="minorEastAsia" w:hAnsiTheme="minorHAnsi" w:cstheme="minorBidi"/>
           <w:noProof/>
           <w:kern w:val="2"/>
-          <w:lang/>
           <w14:ligatures w14:val="standardContextual"/>
         </w:rPr>
       </w:pPr>
@@ -9266,7 +9101,6 @@
             <w:rFonts w:asciiTheme="minorHAnsi" w:eastAsiaTheme="minorEastAsia" w:hAnsiTheme="minorHAnsi" w:cstheme="minorBidi"/>
             <w:noProof/>
             <w:kern w:val="2"/>
-            <w:lang/>
             <w14:ligatures w14:val="standardContextual"/>
           </w:rPr>
           <w:tab/>
@@ -9328,7 +9162,6 @@
           <w:rFonts w:asciiTheme="minorHAnsi" w:eastAsiaTheme="minorEastAsia" w:hAnsiTheme="minorHAnsi" w:cstheme="minorBidi"/>
           <w:noProof/>
           <w:kern w:val="2"/>
-          <w:lang/>
           <w14:ligatures w14:val="standardContextual"/>
         </w:rPr>
       </w:pPr>
@@ -9345,7 +9178,6 @@
             <w:rFonts w:asciiTheme="minorHAnsi" w:eastAsiaTheme="minorEastAsia" w:hAnsiTheme="minorHAnsi" w:cstheme="minorBidi"/>
             <w:noProof/>
             <w:kern w:val="2"/>
-            <w:lang/>
             <w14:ligatures w14:val="standardContextual"/>
           </w:rPr>
           <w:tab/>
@@ -9407,7 +9239,6 @@
           <w:rFonts w:asciiTheme="minorHAnsi" w:eastAsiaTheme="minorEastAsia" w:hAnsiTheme="minorHAnsi" w:cstheme="minorBidi"/>
           <w:noProof/>
           <w:kern w:val="2"/>
-          <w:lang/>
           <w14:ligatures w14:val="standardContextual"/>
         </w:rPr>
       </w:pPr>
@@ -9424,7 +9255,6 @@
             <w:rFonts w:asciiTheme="minorHAnsi" w:eastAsiaTheme="minorEastAsia" w:hAnsiTheme="minorHAnsi" w:cstheme="minorBidi"/>
             <w:noProof/>
             <w:kern w:val="2"/>
-            <w:lang/>
             <w14:ligatures w14:val="standardContextual"/>
           </w:rPr>
           <w:tab/>
@@ -9486,7 +9316,6 @@
           <w:rFonts w:asciiTheme="minorHAnsi" w:eastAsiaTheme="minorEastAsia" w:hAnsiTheme="minorHAnsi" w:cstheme="minorBidi"/>
           <w:noProof/>
           <w:kern w:val="2"/>
-          <w:lang/>
           <w14:ligatures w14:val="standardContextual"/>
         </w:rPr>
       </w:pPr>
@@ -9503,7 +9332,6 @@
             <w:rFonts w:asciiTheme="minorHAnsi" w:eastAsiaTheme="minorEastAsia" w:hAnsiTheme="minorHAnsi" w:cstheme="minorBidi"/>
             <w:noProof/>
             <w:kern w:val="2"/>
-            <w:lang/>
             <w14:ligatures w14:val="standardContextual"/>
           </w:rPr>
           <w:tab/>
@@ -9565,7 +9393,6 @@
           <w:rFonts w:asciiTheme="minorHAnsi" w:eastAsiaTheme="minorEastAsia" w:hAnsiTheme="minorHAnsi" w:cstheme="minorBidi"/>
           <w:noProof/>
           <w:kern w:val="2"/>
-          <w:lang/>
           <w14:ligatures w14:val="standardContextual"/>
         </w:rPr>
       </w:pPr>
@@ -9582,7 +9409,6 @@
             <w:rFonts w:asciiTheme="minorHAnsi" w:eastAsiaTheme="minorEastAsia" w:hAnsiTheme="minorHAnsi" w:cstheme="minorBidi"/>
             <w:noProof/>
             <w:kern w:val="2"/>
-            <w:lang/>
             <w14:ligatures w14:val="standardContextual"/>
           </w:rPr>
           <w:tab/>
@@ -9644,7 +9470,6 @@
           <w:rFonts w:asciiTheme="minorHAnsi" w:eastAsiaTheme="minorEastAsia" w:hAnsiTheme="minorHAnsi" w:cstheme="minorBidi"/>
           <w:noProof/>
           <w:kern w:val="2"/>
-          <w:lang/>
           <w14:ligatures w14:val="standardContextual"/>
         </w:rPr>
       </w:pPr>
@@ -9661,7 +9486,6 @@
             <w:rFonts w:asciiTheme="minorHAnsi" w:eastAsiaTheme="minorEastAsia" w:hAnsiTheme="minorHAnsi" w:cstheme="minorBidi"/>
             <w:noProof/>
             <w:kern w:val="2"/>
-            <w:lang/>
             <w14:ligatures w14:val="standardContextual"/>
           </w:rPr>
           <w:tab/>
@@ -9723,7 +9547,6 @@
           <w:rFonts w:asciiTheme="minorHAnsi" w:eastAsiaTheme="minorEastAsia" w:hAnsiTheme="minorHAnsi" w:cstheme="minorBidi"/>
           <w:noProof/>
           <w:kern w:val="2"/>
-          <w:lang/>
           <w14:ligatures w14:val="standardContextual"/>
         </w:rPr>
       </w:pPr>
@@ -9740,7 +9563,6 @@
             <w:rFonts w:asciiTheme="minorHAnsi" w:eastAsiaTheme="minorEastAsia" w:hAnsiTheme="minorHAnsi" w:cstheme="minorBidi"/>
             <w:noProof/>
             <w:kern w:val="2"/>
-            <w:lang/>
             <w14:ligatures w14:val="standardContextual"/>
           </w:rPr>
           <w:tab/>
@@ -9802,7 +9624,6 @@
           <w:rFonts w:asciiTheme="minorHAnsi" w:eastAsiaTheme="minorEastAsia" w:hAnsiTheme="minorHAnsi" w:cstheme="minorBidi"/>
           <w:noProof/>
           <w:kern w:val="2"/>
-          <w:lang/>
           <w14:ligatures w14:val="standardContextual"/>
         </w:rPr>
       </w:pPr>
@@ -9819,7 +9640,6 @@
             <w:rFonts w:asciiTheme="minorHAnsi" w:eastAsiaTheme="minorEastAsia" w:hAnsiTheme="minorHAnsi" w:cstheme="minorBidi"/>
             <w:noProof/>
             <w:kern w:val="2"/>
-            <w:lang/>
             <w14:ligatures w14:val="standardContextual"/>
           </w:rPr>
           <w:tab/>
@@ -9881,7 +9701,6 @@
           <w:rFonts w:asciiTheme="minorHAnsi" w:eastAsiaTheme="minorEastAsia" w:hAnsiTheme="minorHAnsi" w:cstheme="minorBidi"/>
           <w:noProof/>
           <w:kern w:val="2"/>
-          <w:lang/>
           <w14:ligatures w14:val="standardContextual"/>
         </w:rPr>
       </w:pPr>
@@ -9898,7 +9717,6 @@
             <w:rFonts w:asciiTheme="minorHAnsi" w:eastAsiaTheme="minorEastAsia" w:hAnsiTheme="minorHAnsi" w:cstheme="minorBidi"/>
             <w:noProof/>
             <w:kern w:val="2"/>
-            <w:lang/>
             <w14:ligatures w14:val="standardContextual"/>
           </w:rPr>
           <w:tab/>
@@ -9960,7 +9778,6 @@
           <w:rFonts w:asciiTheme="minorHAnsi" w:eastAsiaTheme="minorEastAsia" w:hAnsiTheme="minorHAnsi" w:cstheme="minorBidi"/>
           <w:noProof/>
           <w:kern w:val="2"/>
-          <w:lang/>
           <w14:ligatures w14:val="standardContextual"/>
         </w:rPr>
       </w:pPr>
@@ -9977,7 +9794,6 @@
             <w:rFonts w:asciiTheme="minorHAnsi" w:eastAsiaTheme="minorEastAsia" w:hAnsiTheme="minorHAnsi" w:cstheme="minorBidi"/>
             <w:noProof/>
             <w:kern w:val="2"/>
-            <w:lang/>
             <w14:ligatures w14:val="standardContextual"/>
           </w:rPr>
           <w:tab/>
@@ -10039,7 +9855,6 @@
           <w:rFonts w:asciiTheme="minorHAnsi" w:eastAsiaTheme="minorEastAsia" w:hAnsiTheme="minorHAnsi" w:cstheme="minorBidi"/>
           <w:noProof/>
           <w:kern w:val="2"/>
-          <w:lang/>
           <w14:ligatures w14:val="standardContextual"/>
         </w:rPr>
       </w:pPr>
@@ -10056,7 +9871,6 @@
             <w:rFonts w:asciiTheme="minorHAnsi" w:eastAsiaTheme="minorEastAsia" w:hAnsiTheme="minorHAnsi" w:cstheme="minorBidi"/>
             <w:noProof/>
             <w:kern w:val="2"/>
-            <w:lang/>
             <w14:ligatures w14:val="standardContextual"/>
           </w:rPr>
           <w:tab/>
@@ -10118,7 +9932,6 @@
           <w:rFonts w:asciiTheme="minorHAnsi" w:eastAsiaTheme="minorEastAsia" w:hAnsiTheme="minorHAnsi" w:cstheme="minorBidi"/>
           <w:noProof/>
           <w:kern w:val="2"/>
-          <w:lang/>
           <w14:ligatures w14:val="standardContextual"/>
         </w:rPr>
       </w:pPr>
@@ -10135,7 +9948,6 @@
             <w:rFonts w:asciiTheme="minorHAnsi" w:eastAsiaTheme="minorEastAsia" w:hAnsiTheme="minorHAnsi" w:cstheme="minorBidi"/>
             <w:noProof/>
             <w:kern w:val="2"/>
-            <w:lang/>
             <w14:ligatures w14:val="standardContextual"/>
           </w:rPr>
           <w:tab/>
@@ -10198,7 +10010,6 @@
           <w:caps w:val="0"/>
           <w:noProof/>
           <w:kern w:val="2"/>
-          <w:lang/>
           <w14:ligatures w14:val="standardContextual"/>
         </w:rPr>
       </w:pPr>
@@ -10216,7 +10027,6 @@
             <w:caps w:val="0"/>
             <w:noProof/>
             <w:kern w:val="2"/>
-            <w:lang/>
             <w14:ligatures w14:val="standardContextual"/>
           </w:rPr>
           <w:tab/>
@@ -10278,7 +10088,6 @@
           <w:rFonts w:asciiTheme="minorHAnsi" w:eastAsiaTheme="minorEastAsia" w:hAnsiTheme="minorHAnsi" w:cstheme="minorBidi"/>
           <w:noProof/>
           <w:kern w:val="2"/>
-          <w:lang/>
           <w14:ligatures w14:val="standardContextual"/>
         </w:rPr>
       </w:pPr>
@@ -10295,7 +10104,6 @@
             <w:rFonts w:asciiTheme="minorHAnsi" w:eastAsiaTheme="minorEastAsia" w:hAnsiTheme="minorHAnsi" w:cstheme="minorBidi"/>
             <w:noProof/>
             <w:kern w:val="2"/>
-            <w:lang/>
             <w14:ligatures w14:val="standardContextual"/>
           </w:rPr>
           <w:tab/>
@@ -10357,7 +10165,6 @@
           <w:rFonts w:asciiTheme="minorHAnsi" w:eastAsiaTheme="minorEastAsia" w:hAnsiTheme="minorHAnsi" w:cstheme="minorBidi"/>
           <w:noProof/>
           <w:kern w:val="2"/>
-          <w:lang/>
           <w14:ligatures w14:val="standardContextual"/>
         </w:rPr>
       </w:pPr>
@@ -10374,7 +10181,6 @@
             <w:rFonts w:asciiTheme="minorHAnsi" w:eastAsiaTheme="minorEastAsia" w:hAnsiTheme="minorHAnsi" w:cstheme="minorBidi"/>
             <w:noProof/>
             <w:kern w:val="2"/>
-            <w:lang/>
             <w14:ligatures w14:val="standardContextual"/>
           </w:rPr>
           <w:tab/>
@@ -10436,7 +10242,6 @@
           <w:rFonts w:asciiTheme="minorHAnsi" w:eastAsiaTheme="minorEastAsia" w:hAnsiTheme="minorHAnsi" w:cstheme="minorBidi"/>
           <w:noProof/>
           <w:kern w:val="2"/>
-          <w:lang/>
           <w14:ligatures w14:val="standardContextual"/>
         </w:rPr>
       </w:pPr>
@@ -10453,7 +10258,6 @@
             <w:rFonts w:asciiTheme="minorHAnsi" w:eastAsiaTheme="minorEastAsia" w:hAnsiTheme="minorHAnsi" w:cstheme="minorBidi"/>
             <w:noProof/>
             <w:kern w:val="2"/>
-            <w:lang/>
             <w14:ligatures w14:val="standardContextual"/>
           </w:rPr>
           <w:tab/>
@@ -10515,7 +10319,6 @@
           <w:rFonts w:asciiTheme="minorHAnsi" w:eastAsiaTheme="minorEastAsia" w:hAnsiTheme="minorHAnsi" w:cstheme="minorBidi"/>
           <w:noProof/>
           <w:kern w:val="2"/>
-          <w:lang/>
           <w14:ligatures w14:val="standardContextual"/>
         </w:rPr>
       </w:pPr>
@@ -10532,7 +10335,6 @@
             <w:rFonts w:asciiTheme="minorHAnsi" w:eastAsiaTheme="minorEastAsia" w:hAnsiTheme="minorHAnsi" w:cstheme="minorBidi"/>
             <w:noProof/>
             <w:kern w:val="2"/>
-            <w:lang/>
             <w14:ligatures w14:val="standardContextual"/>
           </w:rPr>
           <w:tab/>
@@ -10594,7 +10396,6 @@
           <w:rFonts w:asciiTheme="minorHAnsi" w:eastAsiaTheme="minorEastAsia" w:hAnsiTheme="minorHAnsi" w:cstheme="minorBidi"/>
           <w:noProof/>
           <w:kern w:val="2"/>
-          <w:lang/>
           <w14:ligatures w14:val="standardContextual"/>
         </w:rPr>
       </w:pPr>
@@ -10611,7 +10412,6 @@
             <w:rFonts w:asciiTheme="minorHAnsi" w:eastAsiaTheme="minorEastAsia" w:hAnsiTheme="minorHAnsi" w:cstheme="minorBidi"/>
             <w:noProof/>
             <w:kern w:val="2"/>
-            <w:lang/>
             <w14:ligatures w14:val="standardContextual"/>
           </w:rPr>
           <w:tab/>
@@ -10673,7 +10473,6 @@
           <w:rFonts w:asciiTheme="minorHAnsi" w:eastAsiaTheme="minorEastAsia" w:hAnsiTheme="minorHAnsi" w:cstheme="minorBidi"/>
           <w:noProof/>
           <w:kern w:val="2"/>
-          <w:lang/>
           <w14:ligatures w14:val="standardContextual"/>
         </w:rPr>
       </w:pPr>
@@ -10690,7 +10489,6 @@
             <w:rFonts w:asciiTheme="minorHAnsi" w:eastAsiaTheme="minorEastAsia" w:hAnsiTheme="minorHAnsi" w:cstheme="minorBidi"/>
             <w:noProof/>
             <w:kern w:val="2"/>
-            <w:lang/>
             <w14:ligatures w14:val="standardContextual"/>
           </w:rPr>
           <w:tab/>
@@ -10752,7 +10550,6 @@
           <w:rFonts w:asciiTheme="minorHAnsi" w:eastAsiaTheme="minorEastAsia" w:hAnsiTheme="minorHAnsi" w:cstheme="minorBidi"/>
           <w:noProof/>
           <w:kern w:val="2"/>
-          <w:lang/>
           <w14:ligatures w14:val="standardContextual"/>
         </w:rPr>
       </w:pPr>
@@ -10769,7 +10566,6 @@
             <w:rFonts w:asciiTheme="minorHAnsi" w:eastAsiaTheme="minorEastAsia" w:hAnsiTheme="minorHAnsi" w:cstheme="minorBidi"/>
             <w:noProof/>
             <w:kern w:val="2"/>
-            <w:lang/>
             <w14:ligatures w14:val="standardContextual"/>
           </w:rPr>
           <w:tab/>
@@ -10831,7 +10627,6 @@
           <w:rFonts w:asciiTheme="minorHAnsi" w:eastAsiaTheme="minorEastAsia" w:hAnsiTheme="minorHAnsi" w:cstheme="minorBidi"/>
           <w:noProof/>
           <w:kern w:val="2"/>
-          <w:lang/>
           <w14:ligatures w14:val="standardContextual"/>
         </w:rPr>
       </w:pPr>
@@ -10848,7 +10643,6 @@
             <w:rFonts w:asciiTheme="minorHAnsi" w:eastAsiaTheme="minorEastAsia" w:hAnsiTheme="minorHAnsi" w:cstheme="minorBidi"/>
             <w:noProof/>
             <w:kern w:val="2"/>
-            <w:lang/>
             <w14:ligatures w14:val="standardContextual"/>
           </w:rPr>
           <w:tab/>
@@ -10910,7 +10704,6 @@
           <w:rFonts w:asciiTheme="minorHAnsi" w:eastAsiaTheme="minorEastAsia" w:hAnsiTheme="minorHAnsi" w:cstheme="minorBidi"/>
           <w:noProof/>
           <w:kern w:val="2"/>
-          <w:lang/>
           <w14:ligatures w14:val="standardContextual"/>
         </w:rPr>
       </w:pPr>
@@ -10927,7 +10720,6 @@
             <w:rFonts w:asciiTheme="minorHAnsi" w:eastAsiaTheme="minorEastAsia" w:hAnsiTheme="minorHAnsi" w:cstheme="minorBidi"/>
             <w:noProof/>
             <w:kern w:val="2"/>
-            <w:lang/>
             <w14:ligatures w14:val="standardContextual"/>
           </w:rPr>
           <w:tab/>
@@ -10989,7 +10781,6 @@
           <w:rFonts w:asciiTheme="minorHAnsi" w:eastAsiaTheme="minorEastAsia" w:hAnsiTheme="minorHAnsi" w:cstheme="minorBidi"/>
           <w:noProof/>
           <w:kern w:val="2"/>
-          <w:lang/>
           <w14:ligatures w14:val="standardContextual"/>
         </w:rPr>
       </w:pPr>
@@ -11006,7 +10797,6 @@
             <w:rFonts w:asciiTheme="minorHAnsi" w:eastAsiaTheme="minorEastAsia" w:hAnsiTheme="minorHAnsi" w:cstheme="minorBidi"/>
             <w:noProof/>
             <w:kern w:val="2"/>
-            <w:lang/>
             <w14:ligatures w14:val="standardContextual"/>
           </w:rPr>
           <w:tab/>
@@ -11068,7 +10858,6 @@
           <w:rFonts w:asciiTheme="minorHAnsi" w:eastAsiaTheme="minorEastAsia" w:hAnsiTheme="minorHAnsi" w:cstheme="minorBidi"/>
           <w:noProof/>
           <w:kern w:val="2"/>
-          <w:lang/>
           <w14:ligatures w14:val="standardContextual"/>
         </w:rPr>
       </w:pPr>
@@ -11085,7 +10874,6 @@
             <w:rFonts w:asciiTheme="minorHAnsi" w:eastAsiaTheme="minorEastAsia" w:hAnsiTheme="minorHAnsi" w:cstheme="minorBidi"/>
             <w:noProof/>
             <w:kern w:val="2"/>
-            <w:lang/>
             <w14:ligatures w14:val="standardContextual"/>
           </w:rPr>
           <w:tab/>
@@ -11147,7 +10935,6 @@
           <w:rFonts w:asciiTheme="minorHAnsi" w:eastAsiaTheme="minorEastAsia" w:hAnsiTheme="minorHAnsi" w:cstheme="minorBidi"/>
           <w:noProof/>
           <w:kern w:val="2"/>
-          <w:lang/>
           <w14:ligatures w14:val="standardContextual"/>
         </w:rPr>
       </w:pPr>
@@ -11164,7 +10951,6 @@
             <w:rFonts w:asciiTheme="minorHAnsi" w:eastAsiaTheme="minorEastAsia" w:hAnsiTheme="minorHAnsi" w:cstheme="minorBidi"/>
             <w:noProof/>
             <w:kern w:val="2"/>
-            <w:lang/>
             <w14:ligatures w14:val="standardContextual"/>
           </w:rPr>
           <w:tab/>
@@ -11226,7 +11012,6 @@
           <w:rFonts w:asciiTheme="minorHAnsi" w:eastAsiaTheme="minorEastAsia" w:hAnsiTheme="minorHAnsi" w:cstheme="minorBidi"/>
           <w:noProof/>
           <w:kern w:val="2"/>
-          <w:lang/>
           <w14:ligatures w14:val="standardContextual"/>
         </w:rPr>
       </w:pPr>
@@ -11243,7 +11028,6 @@
             <w:rFonts w:asciiTheme="minorHAnsi" w:eastAsiaTheme="minorEastAsia" w:hAnsiTheme="minorHAnsi" w:cstheme="minorBidi"/>
             <w:noProof/>
             <w:kern w:val="2"/>
-            <w:lang/>
             <w14:ligatures w14:val="standardContextual"/>
           </w:rPr>
           <w:tab/>
@@ -11305,7 +11089,6 @@
           <w:rFonts w:asciiTheme="minorHAnsi" w:eastAsiaTheme="minorEastAsia" w:hAnsiTheme="minorHAnsi" w:cstheme="minorBidi"/>
           <w:noProof/>
           <w:kern w:val="2"/>
-          <w:lang/>
           <w14:ligatures w14:val="standardContextual"/>
         </w:rPr>
       </w:pPr>
@@ -11322,7 +11105,6 @@
             <w:rFonts w:asciiTheme="minorHAnsi" w:eastAsiaTheme="minorEastAsia" w:hAnsiTheme="minorHAnsi" w:cstheme="minorBidi"/>
             <w:noProof/>
             <w:kern w:val="2"/>
-            <w:lang/>
             <w14:ligatures w14:val="standardContextual"/>
           </w:rPr>
           <w:tab/>
@@ -11384,7 +11166,6 @@
           <w:rFonts w:asciiTheme="minorHAnsi" w:eastAsiaTheme="minorEastAsia" w:hAnsiTheme="minorHAnsi" w:cstheme="minorBidi"/>
           <w:noProof/>
           <w:kern w:val="2"/>
-          <w:lang/>
           <w14:ligatures w14:val="standardContextual"/>
         </w:rPr>
       </w:pPr>
@@ -11401,7 +11182,6 @@
             <w:rFonts w:asciiTheme="minorHAnsi" w:eastAsiaTheme="minorEastAsia" w:hAnsiTheme="minorHAnsi" w:cstheme="minorBidi"/>
             <w:noProof/>
             <w:kern w:val="2"/>
-            <w:lang/>
             <w14:ligatures w14:val="standardContextual"/>
           </w:rPr>
           <w:tab/>
@@ -11463,7 +11243,6 @@
           <w:rFonts w:asciiTheme="minorHAnsi" w:eastAsiaTheme="minorEastAsia" w:hAnsiTheme="minorHAnsi" w:cstheme="minorBidi"/>
           <w:noProof/>
           <w:kern w:val="2"/>
-          <w:lang/>
           <w14:ligatures w14:val="standardContextual"/>
         </w:rPr>
       </w:pPr>
@@ -11480,7 +11259,6 @@
             <w:rFonts w:asciiTheme="minorHAnsi" w:eastAsiaTheme="minorEastAsia" w:hAnsiTheme="minorHAnsi" w:cstheme="minorBidi"/>
             <w:noProof/>
             <w:kern w:val="2"/>
-            <w:lang/>
             <w14:ligatures w14:val="standardContextual"/>
           </w:rPr>
           <w:tab/>
@@ -11542,7 +11320,6 @@
           <w:rFonts w:asciiTheme="minorHAnsi" w:eastAsiaTheme="minorEastAsia" w:hAnsiTheme="minorHAnsi" w:cstheme="minorBidi"/>
           <w:noProof/>
           <w:kern w:val="2"/>
-          <w:lang/>
           <w14:ligatures w14:val="standardContextual"/>
         </w:rPr>
       </w:pPr>
@@ -11559,7 +11336,6 @@
             <w:rFonts w:asciiTheme="minorHAnsi" w:eastAsiaTheme="minorEastAsia" w:hAnsiTheme="minorHAnsi" w:cstheme="minorBidi"/>
             <w:noProof/>
             <w:kern w:val="2"/>
-            <w:lang/>
             <w14:ligatures w14:val="standardContextual"/>
           </w:rPr>
           <w:tab/>
@@ -11621,7 +11397,6 @@
           <w:rFonts w:asciiTheme="minorHAnsi" w:eastAsiaTheme="minorEastAsia" w:hAnsiTheme="minorHAnsi" w:cstheme="minorBidi"/>
           <w:noProof/>
           <w:kern w:val="2"/>
-          <w:lang/>
           <w14:ligatures w14:val="standardContextual"/>
         </w:rPr>
       </w:pPr>
@@ -11638,7 +11413,6 @@
             <w:rFonts w:asciiTheme="minorHAnsi" w:eastAsiaTheme="minorEastAsia" w:hAnsiTheme="minorHAnsi" w:cstheme="minorBidi"/>
             <w:noProof/>
             <w:kern w:val="2"/>
-            <w:lang/>
             <w14:ligatures w14:val="standardContextual"/>
           </w:rPr>
           <w:tab/>
@@ -11700,7 +11474,6 @@
           <w:rFonts w:asciiTheme="minorHAnsi" w:eastAsiaTheme="minorEastAsia" w:hAnsiTheme="minorHAnsi" w:cstheme="minorBidi"/>
           <w:noProof/>
           <w:kern w:val="2"/>
-          <w:lang/>
           <w14:ligatures w14:val="standardContextual"/>
         </w:rPr>
       </w:pPr>
@@ -11717,7 +11490,6 @@
             <w:rFonts w:asciiTheme="minorHAnsi" w:eastAsiaTheme="minorEastAsia" w:hAnsiTheme="minorHAnsi" w:cstheme="minorBidi"/>
             <w:noProof/>
             <w:kern w:val="2"/>
-            <w:lang/>
             <w14:ligatures w14:val="standardContextual"/>
           </w:rPr>
           <w:tab/>
@@ -11779,7 +11551,6 @@
           <w:rFonts w:asciiTheme="minorHAnsi" w:eastAsiaTheme="minorEastAsia" w:hAnsiTheme="minorHAnsi" w:cstheme="minorBidi"/>
           <w:noProof/>
           <w:kern w:val="2"/>
-          <w:lang/>
           <w14:ligatures w14:val="standardContextual"/>
         </w:rPr>
       </w:pPr>
@@ -11796,7 +11567,6 @@
             <w:rFonts w:asciiTheme="minorHAnsi" w:eastAsiaTheme="minorEastAsia" w:hAnsiTheme="minorHAnsi" w:cstheme="minorBidi"/>
             <w:noProof/>
             <w:kern w:val="2"/>
-            <w:lang/>
             <w14:ligatures w14:val="standardContextual"/>
           </w:rPr>
           <w:tab/>
@@ -11858,7 +11628,6 @@
           <w:rFonts w:asciiTheme="minorHAnsi" w:eastAsiaTheme="minorEastAsia" w:hAnsiTheme="minorHAnsi" w:cstheme="minorBidi"/>
           <w:noProof/>
           <w:kern w:val="2"/>
-          <w:lang/>
           <w14:ligatures w14:val="standardContextual"/>
         </w:rPr>
       </w:pPr>
@@ -11875,7 +11644,6 @@
             <w:rFonts w:asciiTheme="minorHAnsi" w:eastAsiaTheme="minorEastAsia" w:hAnsiTheme="minorHAnsi" w:cstheme="minorBidi"/>
             <w:noProof/>
             <w:kern w:val="2"/>
-            <w:lang/>
             <w14:ligatures w14:val="standardContextual"/>
           </w:rPr>
           <w:tab/>
@@ -11937,7 +11705,6 @@
           <w:rFonts w:asciiTheme="minorHAnsi" w:eastAsiaTheme="minorEastAsia" w:hAnsiTheme="minorHAnsi" w:cstheme="minorBidi"/>
           <w:noProof/>
           <w:kern w:val="2"/>
-          <w:lang/>
           <w14:ligatures w14:val="standardContextual"/>
         </w:rPr>
       </w:pPr>
@@ -11954,7 +11721,6 @@
             <w:rFonts w:asciiTheme="minorHAnsi" w:eastAsiaTheme="minorEastAsia" w:hAnsiTheme="minorHAnsi" w:cstheme="minorBidi"/>
             <w:noProof/>
             <w:kern w:val="2"/>
-            <w:lang/>
             <w14:ligatures w14:val="standardContextual"/>
           </w:rPr>
           <w:tab/>
@@ -12017,7 +11783,6 @@
           <w:caps w:val="0"/>
           <w:noProof/>
           <w:kern w:val="2"/>
-          <w:lang/>
           <w14:ligatures w14:val="standardContextual"/>
         </w:rPr>
       </w:pPr>
@@ -12035,7 +11800,6 @@
             <w:caps w:val="0"/>
             <w:noProof/>
             <w:kern w:val="2"/>
-            <w:lang/>
             <w14:ligatures w14:val="standardContextual"/>
           </w:rPr>
           <w:tab/>
@@ -12097,7 +11861,6 @@
           <w:rFonts w:asciiTheme="minorHAnsi" w:eastAsiaTheme="minorEastAsia" w:hAnsiTheme="minorHAnsi" w:cstheme="minorBidi"/>
           <w:noProof/>
           <w:kern w:val="2"/>
-          <w:lang/>
           <w14:ligatures w14:val="standardContextual"/>
         </w:rPr>
       </w:pPr>
@@ -12114,7 +11877,6 @@
             <w:rFonts w:asciiTheme="minorHAnsi" w:eastAsiaTheme="minorEastAsia" w:hAnsiTheme="minorHAnsi" w:cstheme="minorBidi"/>
             <w:noProof/>
             <w:kern w:val="2"/>
-            <w:lang/>
             <w14:ligatures w14:val="standardContextual"/>
           </w:rPr>
           <w:tab/>
@@ -12176,7 +11938,6 @@
           <w:rFonts w:asciiTheme="minorHAnsi" w:eastAsiaTheme="minorEastAsia" w:hAnsiTheme="minorHAnsi" w:cstheme="minorBidi"/>
           <w:noProof/>
           <w:kern w:val="2"/>
-          <w:lang/>
           <w14:ligatures w14:val="standardContextual"/>
         </w:rPr>
       </w:pPr>
@@ -12193,7 +11954,6 @@
             <w:rFonts w:asciiTheme="minorHAnsi" w:eastAsiaTheme="minorEastAsia" w:hAnsiTheme="minorHAnsi" w:cstheme="minorBidi"/>
             <w:noProof/>
             <w:kern w:val="2"/>
-            <w:lang/>
             <w14:ligatures w14:val="standardContextual"/>
           </w:rPr>
           <w:tab/>
@@ -12255,7 +12015,6 @@
           <w:rFonts w:asciiTheme="minorHAnsi" w:eastAsiaTheme="minorEastAsia" w:hAnsiTheme="minorHAnsi" w:cstheme="minorBidi"/>
           <w:noProof/>
           <w:kern w:val="2"/>
-          <w:lang/>
           <w14:ligatures w14:val="standardContextual"/>
         </w:rPr>
       </w:pPr>
@@ -12272,7 +12031,6 @@
             <w:rFonts w:asciiTheme="minorHAnsi" w:eastAsiaTheme="minorEastAsia" w:hAnsiTheme="minorHAnsi" w:cstheme="minorBidi"/>
             <w:noProof/>
             <w:kern w:val="2"/>
-            <w:lang/>
             <w14:ligatures w14:val="standardContextual"/>
           </w:rPr>
           <w:tab/>
@@ -12334,7 +12092,6 @@
           <w:rFonts w:asciiTheme="minorHAnsi" w:eastAsiaTheme="minorEastAsia" w:hAnsiTheme="minorHAnsi" w:cstheme="minorBidi"/>
           <w:noProof/>
           <w:kern w:val="2"/>
-          <w:lang/>
           <w14:ligatures w14:val="standardContextual"/>
         </w:rPr>
       </w:pPr>
@@ -12351,7 +12108,6 @@
             <w:rFonts w:asciiTheme="minorHAnsi" w:eastAsiaTheme="minorEastAsia" w:hAnsiTheme="minorHAnsi" w:cstheme="minorBidi"/>
             <w:noProof/>
             <w:kern w:val="2"/>
-            <w:lang/>
             <w14:ligatures w14:val="standardContextual"/>
           </w:rPr>
           <w:tab/>
@@ -12413,7 +12169,6 @@
           <w:rFonts w:asciiTheme="minorHAnsi" w:eastAsiaTheme="minorEastAsia" w:hAnsiTheme="minorHAnsi" w:cstheme="minorBidi"/>
           <w:noProof/>
           <w:kern w:val="2"/>
-          <w:lang/>
           <w14:ligatures w14:val="standardContextual"/>
         </w:rPr>
       </w:pPr>
@@ -12430,7 +12185,6 @@
             <w:rFonts w:asciiTheme="minorHAnsi" w:eastAsiaTheme="minorEastAsia" w:hAnsiTheme="minorHAnsi" w:cstheme="minorBidi"/>
             <w:noProof/>
             <w:kern w:val="2"/>
-            <w:lang/>
             <w14:ligatures w14:val="standardContextual"/>
           </w:rPr>
           <w:tab/>
@@ -12492,7 +12246,6 @@
           <w:rFonts w:asciiTheme="minorHAnsi" w:eastAsiaTheme="minorEastAsia" w:hAnsiTheme="minorHAnsi" w:cstheme="minorBidi"/>
           <w:noProof/>
           <w:kern w:val="2"/>
-          <w:lang/>
           <w14:ligatures w14:val="standardContextual"/>
         </w:rPr>
       </w:pPr>
@@ -12509,7 +12262,6 @@
             <w:rFonts w:asciiTheme="minorHAnsi" w:eastAsiaTheme="minorEastAsia" w:hAnsiTheme="minorHAnsi" w:cstheme="minorBidi"/>
             <w:noProof/>
             <w:kern w:val="2"/>
-            <w:lang/>
             <w14:ligatures w14:val="standardContextual"/>
           </w:rPr>
           <w:tab/>
@@ -12571,7 +12323,6 @@
           <w:rFonts w:asciiTheme="minorHAnsi" w:eastAsiaTheme="minorEastAsia" w:hAnsiTheme="minorHAnsi" w:cstheme="minorBidi"/>
           <w:noProof/>
           <w:kern w:val="2"/>
-          <w:lang/>
           <w14:ligatures w14:val="standardContextual"/>
         </w:rPr>
       </w:pPr>
@@ -12588,7 +12339,6 @@
             <w:rFonts w:asciiTheme="minorHAnsi" w:eastAsiaTheme="minorEastAsia" w:hAnsiTheme="minorHAnsi" w:cstheme="minorBidi"/>
             <w:noProof/>
             <w:kern w:val="2"/>
-            <w:lang/>
             <w14:ligatures w14:val="standardContextual"/>
           </w:rPr>
           <w:tab/>
@@ -12650,7 +12400,6 @@
           <w:rFonts w:asciiTheme="minorHAnsi" w:eastAsiaTheme="minorEastAsia" w:hAnsiTheme="minorHAnsi" w:cstheme="minorBidi"/>
           <w:noProof/>
           <w:kern w:val="2"/>
-          <w:lang/>
           <w14:ligatures w14:val="standardContextual"/>
         </w:rPr>
       </w:pPr>
@@ -12667,7 +12416,6 @@
             <w:rFonts w:asciiTheme="minorHAnsi" w:eastAsiaTheme="minorEastAsia" w:hAnsiTheme="minorHAnsi" w:cstheme="minorBidi"/>
             <w:noProof/>
             <w:kern w:val="2"/>
-            <w:lang/>
             <w14:ligatures w14:val="standardContextual"/>
           </w:rPr>
           <w:tab/>
@@ -12729,7 +12477,6 @@
           <w:rFonts w:asciiTheme="minorHAnsi" w:eastAsiaTheme="minorEastAsia" w:hAnsiTheme="minorHAnsi" w:cstheme="minorBidi"/>
           <w:noProof/>
           <w:kern w:val="2"/>
-          <w:lang/>
           <w14:ligatures w14:val="standardContextual"/>
         </w:rPr>
       </w:pPr>
@@ -12746,7 +12493,6 @@
             <w:rFonts w:asciiTheme="minorHAnsi" w:eastAsiaTheme="minorEastAsia" w:hAnsiTheme="minorHAnsi" w:cstheme="minorBidi"/>
             <w:noProof/>
             <w:kern w:val="2"/>
-            <w:lang/>
             <w14:ligatures w14:val="standardContextual"/>
           </w:rPr>
           <w:tab/>
@@ -12808,7 +12554,6 @@
           <w:rFonts w:asciiTheme="minorHAnsi" w:eastAsiaTheme="minorEastAsia" w:hAnsiTheme="minorHAnsi" w:cstheme="minorBidi"/>
           <w:noProof/>
           <w:kern w:val="2"/>
-          <w:lang/>
           <w14:ligatures w14:val="standardContextual"/>
         </w:rPr>
       </w:pPr>
@@ -12825,7 +12570,6 @@
             <w:rFonts w:asciiTheme="minorHAnsi" w:eastAsiaTheme="minorEastAsia" w:hAnsiTheme="minorHAnsi" w:cstheme="minorBidi"/>
             <w:noProof/>
             <w:kern w:val="2"/>
-            <w:lang/>
             <w14:ligatures w14:val="standardContextual"/>
           </w:rPr>
           <w:tab/>
@@ -12887,7 +12631,6 @@
           <w:rFonts w:asciiTheme="minorHAnsi" w:eastAsiaTheme="minorEastAsia" w:hAnsiTheme="minorHAnsi" w:cstheme="minorBidi"/>
           <w:noProof/>
           <w:kern w:val="2"/>
-          <w:lang/>
           <w14:ligatures w14:val="standardContextual"/>
         </w:rPr>
       </w:pPr>
@@ -12904,7 +12647,6 @@
             <w:rFonts w:asciiTheme="minorHAnsi" w:eastAsiaTheme="minorEastAsia" w:hAnsiTheme="minorHAnsi" w:cstheme="minorBidi"/>
             <w:noProof/>
             <w:kern w:val="2"/>
-            <w:lang/>
             <w14:ligatures w14:val="standardContextual"/>
           </w:rPr>
           <w:tab/>
@@ -12966,7 +12708,6 @@
           <w:rFonts w:asciiTheme="minorHAnsi" w:eastAsiaTheme="minorEastAsia" w:hAnsiTheme="minorHAnsi" w:cstheme="minorBidi"/>
           <w:noProof/>
           <w:kern w:val="2"/>
-          <w:lang/>
           <w14:ligatures w14:val="standardContextual"/>
         </w:rPr>
       </w:pPr>
@@ -12983,7 +12724,6 @@
             <w:rFonts w:asciiTheme="minorHAnsi" w:eastAsiaTheme="minorEastAsia" w:hAnsiTheme="minorHAnsi" w:cstheme="minorBidi"/>
             <w:noProof/>
             <w:kern w:val="2"/>
-            <w:lang/>
             <w14:ligatures w14:val="standardContextual"/>
           </w:rPr>
           <w:tab/>
@@ -13045,7 +12785,6 @@
           <w:rFonts w:asciiTheme="minorHAnsi" w:eastAsiaTheme="minorEastAsia" w:hAnsiTheme="minorHAnsi" w:cstheme="minorBidi"/>
           <w:noProof/>
           <w:kern w:val="2"/>
-          <w:lang/>
           <w14:ligatures w14:val="standardContextual"/>
         </w:rPr>
       </w:pPr>
@@ -13062,7 +12801,6 @@
             <w:rFonts w:asciiTheme="minorHAnsi" w:eastAsiaTheme="minorEastAsia" w:hAnsiTheme="minorHAnsi" w:cstheme="minorBidi"/>
             <w:noProof/>
             <w:kern w:val="2"/>
-            <w:lang/>
             <w14:ligatures w14:val="standardContextual"/>
           </w:rPr>
           <w:tab/>
@@ -13125,7 +12863,6 @@
           <w:caps w:val="0"/>
           <w:noProof/>
           <w:kern w:val="2"/>
-          <w:lang/>
           <w14:ligatures w14:val="standardContextual"/>
         </w:rPr>
       </w:pPr>
@@ -13143,7 +12880,6 @@
             <w:caps w:val="0"/>
             <w:noProof/>
             <w:kern w:val="2"/>
-            <w:lang/>
             <w14:ligatures w14:val="standardContextual"/>
           </w:rPr>
           <w:tab/>
@@ -13205,7 +12941,6 @@
           <w:rFonts w:asciiTheme="minorHAnsi" w:eastAsiaTheme="minorEastAsia" w:hAnsiTheme="minorHAnsi" w:cstheme="minorBidi"/>
           <w:noProof/>
           <w:kern w:val="2"/>
-          <w:lang/>
           <w14:ligatures w14:val="standardContextual"/>
         </w:rPr>
       </w:pPr>
@@ -13222,7 +12957,6 @@
             <w:rFonts w:asciiTheme="minorHAnsi" w:eastAsiaTheme="minorEastAsia" w:hAnsiTheme="minorHAnsi" w:cstheme="minorBidi"/>
             <w:noProof/>
             <w:kern w:val="2"/>
-            <w:lang/>
             <w14:ligatures w14:val="standardContextual"/>
           </w:rPr>
           <w:tab/>
@@ -13284,7 +13018,6 @@
           <w:rFonts w:asciiTheme="minorHAnsi" w:eastAsiaTheme="minorEastAsia" w:hAnsiTheme="minorHAnsi" w:cstheme="minorBidi"/>
           <w:noProof/>
           <w:kern w:val="2"/>
-          <w:lang/>
           <w14:ligatures w14:val="standardContextual"/>
         </w:rPr>
       </w:pPr>
@@ -13301,7 +13034,6 @@
             <w:rFonts w:asciiTheme="minorHAnsi" w:eastAsiaTheme="minorEastAsia" w:hAnsiTheme="minorHAnsi" w:cstheme="minorBidi"/>
             <w:noProof/>
             <w:kern w:val="2"/>
-            <w:lang/>
             <w14:ligatures w14:val="standardContextual"/>
           </w:rPr>
           <w:tab/>
@@ -13363,7 +13095,6 @@
           <w:rFonts w:asciiTheme="minorHAnsi" w:eastAsiaTheme="minorEastAsia" w:hAnsiTheme="minorHAnsi" w:cstheme="minorBidi"/>
           <w:noProof/>
           <w:kern w:val="2"/>
-          <w:lang/>
           <w14:ligatures w14:val="standardContextual"/>
         </w:rPr>
       </w:pPr>
@@ -13380,7 +13111,6 @@
             <w:rFonts w:asciiTheme="minorHAnsi" w:eastAsiaTheme="minorEastAsia" w:hAnsiTheme="minorHAnsi" w:cstheme="minorBidi"/>
             <w:noProof/>
             <w:kern w:val="2"/>
-            <w:lang/>
             <w14:ligatures w14:val="standardContextual"/>
           </w:rPr>
           <w:tab/>
@@ -13443,7 +13173,6 @@
           <w:caps w:val="0"/>
           <w:noProof/>
           <w:kern w:val="2"/>
-          <w:lang/>
           <w14:ligatures w14:val="standardContextual"/>
         </w:rPr>
       </w:pPr>
@@ -13461,7 +13190,6 @@
             <w:caps w:val="0"/>
             <w:noProof/>
             <w:kern w:val="2"/>
-            <w:lang/>
             <w14:ligatures w14:val="standardContextual"/>
           </w:rPr>
           <w:tab/>
@@ -13524,7 +13252,6 @@
           <w:caps w:val="0"/>
           <w:noProof/>
           <w:kern w:val="2"/>
-          <w:lang/>
           <w14:ligatures w14:val="standardContextual"/>
         </w:rPr>
       </w:pPr>
@@ -13542,7 +13269,6 @@
             <w:caps w:val="0"/>
             <w:noProof/>
             <w:kern w:val="2"/>
-            <w:lang/>
             <w14:ligatures w14:val="standardContextual"/>
           </w:rPr>
           <w:tab/>
@@ -44015,9 +43741,18 @@
     <w:p>
       <w:pPr>
         <w:pStyle w:val="Citation"/>
-      </w:pPr>
-      <w:r>
-        <w:t>Vincent JL. Organ dysfunction in patients with severe sepsis. Surg Infect 2006;7:s69.</w:t>
+        <w:rPr>
+          <w:lang w:val="da-DK"/>
+        </w:rPr>
+      </w:pPr>
+      <w:r>
+        <w:t xml:space="preserve">Vincent JL. Organ dysfunction in patients with severe sepsis. </w:t>
+      </w:r>
+      <w:r>
+        <w:rPr>
+          <w:lang w:val="da-DK"/>
+        </w:rPr>
+        <w:t>Surg Infect 2006;7:s69.</w:t>
       </w:r>
     </w:p>
     <w:p>
@@ -44025,7 +43760,13 @@
         <w:pStyle w:val="Citation"/>
       </w:pPr>
       <w:r>
-        <w:t>Wang D, Hu B, Hu C, et al. Clinical characteristics of 138 hospitalized patients with 2019 novel coronavirus–infected pneumonia in Wuhan, China. JAMA 2020. doi:10.1001/jama.2020.1585</w:t>
+        <w:rPr>
+          <w:lang w:val="da-DK"/>
+        </w:rPr>
+        <w:t xml:space="preserve">Wang D, Hu B, Hu C, et al. </w:t>
+      </w:r>
+      <w:r>
+        <w:t>Clinical characteristics of 138 hospitalized patients with 2019 novel coronavirus–infected pneumonia in Wuhan, China. JAMA 2020. doi:10.1001/jama.2020.1585</w:t>
       </w:r>
     </w:p>
     <w:p>
@@ -49376,7 +49117,7 @@
         <w:kern w:val="2"/>
         <w:sz w:val="22"/>
         <w:szCs w:val="22"/>
-        <w:lang w:eastAsia="en-US" w:bidi="ar-SA"/>
+        <w:lang w:val="en-DK" w:eastAsia="en-US" w:bidi="ar-SA"/>
         <w14:ligatures w14:val="standardContextual"/>
       </w:rPr>
     </w:rPrDefault>
@@ -51694,7 +51435,6 @@
       <w:kern w:val="2"/>
       <w:sz w:val="22"/>
       <w:szCs w:val="22"/>
-      <w:lang/>
       <w14:ligatures w14:val="standardContextual"/>
     </w:rPr>
   </w:style>
@@ -52359,15 +52099,21 @@
 </file>
 
 <file path=customXml/item1.xml><?xml version="1.0" encoding="utf-8"?>
-<?mso-contentType ?>
-<FormTemplates xmlns="http://schemas.microsoft.com/sharepoint/v3/contenttype/forms">
-  <Display>DocumentLibraryForm</Display>
-  <Edit>DocumentLibraryForm</Edit>
-  <New>DocumentLibraryForm</New>
-</FormTemplates>
+<b:Sources xmlns:b="http://schemas.openxmlformats.org/officeDocument/2006/bibliography" xmlns="http://schemas.openxmlformats.org/officeDocument/2006/bibliography" SelectedStyle="\APASixthEditionOfficeOnline.xsl" StyleName="APA" Version="6"/>
 </file>
 
 <file path=customXml/item2.xml><?xml version="1.0" encoding="utf-8"?>
+<p:properties xmlns:p="http://schemas.microsoft.com/office/2006/metadata/properties" xmlns:xsi="http://www.w3.org/2001/XMLSchema-instance" xmlns:pc="http://schemas.microsoft.com/office/infopath/2007/PartnerControls">
+  <documentManagement>
+    <lcf76f155ced4ddcb4097134ff3c332f xmlns="98eacbea-7562-4a40-a7f2-e999cdc0cec5">
+      <Terms xmlns="http://schemas.microsoft.com/office/infopath/2007/PartnerControls"/>
+    </lcf76f155ced4ddcb4097134ff3c332f>
+    <TaxCatchAll xmlns="75bf9804-c18d-470a-a27f-eeaf4abcd247" xsi:nil="true"/>
+  </documentManagement>
+</p:properties>
+</file>
+
+<file path=customXml/item3.xml><?xml version="1.0" encoding="utf-8"?>
 <ct:contentTypeSchema xmlns:ct="http://schemas.microsoft.com/office/2006/metadata/contentType" xmlns:ma="http://schemas.microsoft.com/office/2006/metadata/properties/metaAttributes" ct:_="" ma:_="" ma:contentTypeName="Document" ma:contentTypeID="0x010100D47D794EB48E7144959FE534A5ED3D9A" ma:contentTypeVersion="13" ma:contentTypeDescription="Create a new document." ma:contentTypeScope="" ma:versionID="332ebed6bf1f21540ac8ed4139e2af2e">
   <xsd:schema xmlns:xsd="http://www.w3.org/2001/XMLSchema" xmlns:xs="http://www.w3.org/2001/XMLSchema" xmlns:p="http://schemas.microsoft.com/office/2006/metadata/properties" xmlns:ns2="98eacbea-7562-4a40-a7f2-e999cdc0cec5" xmlns:ns3="75bf9804-c18d-470a-a27f-eeaf4abcd247" targetNamespace="http://schemas.microsoft.com/office/2006/metadata/properties" ma:root="true" ma:fieldsID="9643d50ff51ef4e8f7efba950a0a6c6b" ns2:_="" ns3:_="">
     <xsd:import namespace="98eacbea-7562-4a40-a7f2-e999cdc0cec5"/>
@@ -52574,30 +52320,35 @@
 </ct:contentTypeSchema>
 </file>
 
-<file path=customXml/item3.xml><?xml version="1.0" encoding="utf-8"?>
-<p:properties xmlns:p="http://schemas.microsoft.com/office/2006/metadata/properties" xmlns:xsi="http://www.w3.org/2001/XMLSchema-instance" xmlns:pc="http://schemas.microsoft.com/office/infopath/2007/PartnerControls">
-  <documentManagement>
-    <lcf76f155ced4ddcb4097134ff3c332f xmlns="98eacbea-7562-4a40-a7f2-e999cdc0cec5">
-      <Terms xmlns="http://schemas.microsoft.com/office/infopath/2007/PartnerControls"/>
-    </lcf76f155ced4ddcb4097134ff3c332f>
-    <TaxCatchAll xmlns="75bf9804-c18d-470a-a27f-eeaf4abcd247" xsi:nil="true"/>
-  </documentManagement>
-</p:properties>
-</file>
-
 <file path=customXml/item4.xml><?xml version="1.0" encoding="utf-8"?>
-<b:Sources xmlns:b="http://schemas.openxmlformats.org/officeDocument/2006/bibliography" xmlns="http://schemas.openxmlformats.org/officeDocument/2006/bibliography" SelectedStyle="\APASixthEditionOfficeOnline.xsl" StyleName="APA" Version="6"/>
+<?mso-contentType ?>
+<FormTemplates xmlns="http://schemas.microsoft.com/sharepoint/v3/contenttype/forms">
+  <Display>DocumentLibraryForm</Display>
+  <Edit>DocumentLibraryForm</Edit>
+  <New>DocumentLibraryForm</New>
+</FormTemplates>
 </file>
 
 <file path=customXml/itemProps1.xml><?xml version="1.0" encoding="utf-8"?>
-<ds:datastoreItem xmlns:ds="http://schemas.openxmlformats.org/officeDocument/2006/customXml" ds:itemID="{48E1CE66-AAF7-4A26-A189-3FC3A7C20C01}">
+<ds:datastoreItem xmlns:ds="http://schemas.openxmlformats.org/officeDocument/2006/customXml" ds:itemID="{B65DD72E-8E1F-472F-9954-9E676E0CBAE9}">
   <ds:schemaRefs>
-    <ds:schemaRef ds:uri="http://schemas.microsoft.com/sharepoint/v3/contenttype/forms"/>
+    <ds:schemaRef ds:uri="http://schemas.openxmlformats.org/officeDocument/2006/bibliography"/>
   </ds:schemaRefs>
 </ds:datastoreItem>
 </file>
 
 <file path=customXml/itemProps2.xml><?xml version="1.0" encoding="utf-8"?>
+<ds:datastoreItem xmlns:ds="http://schemas.openxmlformats.org/officeDocument/2006/customXml" ds:itemID="{830F540F-FF22-4F70-87CA-29A7F391CF3D}">
+  <ds:schemaRefs>
+    <ds:schemaRef ds:uri="http://schemas.microsoft.com/office/2006/metadata/properties"/>
+    <ds:schemaRef ds:uri="http://schemas.microsoft.com/office/infopath/2007/PartnerControls"/>
+    <ds:schemaRef ds:uri="98eacbea-7562-4a40-a7f2-e999cdc0cec5"/>
+    <ds:schemaRef ds:uri="75bf9804-c18d-470a-a27f-eeaf4abcd247"/>
+  </ds:schemaRefs>
+</ds:datastoreItem>
+</file>
+
+<file path=customXml/itemProps3.xml><?xml version="1.0" encoding="utf-8"?>
 <ds:datastoreItem xmlns:ds="http://schemas.openxmlformats.org/officeDocument/2006/customXml" ds:itemID="{FEF3DB0D-DFF1-4750-B553-64924254F999}">
   <ds:schemaRefs>
     <ds:schemaRef ds:uri="http://schemas.microsoft.com/office/2006/metadata/contentType"/>
@@ -52616,21 +52367,10 @@
 </ds:datastoreItem>
 </file>
 
-<file path=customXml/itemProps3.xml><?xml version="1.0" encoding="utf-8"?>
-<ds:datastoreItem xmlns:ds="http://schemas.openxmlformats.org/officeDocument/2006/customXml" ds:itemID="{830F540F-FF22-4F70-87CA-29A7F391CF3D}">
+<file path=customXml/itemProps4.xml><?xml version="1.0" encoding="utf-8"?>
+<ds:datastoreItem xmlns:ds="http://schemas.openxmlformats.org/officeDocument/2006/customXml" ds:itemID="{48E1CE66-AAF7-4A26-A189-3FC3A7C20C01}">
   <ds:schemaRefs>
-    <ds:schemaRef ds:uri="http://schemas.microsoft.com/office/2006/metadata/properties"/>
-    <ds:schemaRef ds:uri="http://schemas.microsoft.com/office/infopath/2007/PartnerControls"/>
-    <ds:schemaRef ds:uri="98eacbea-7562-4a40-a7f2-e999cdc0cec5"/>
-    <ds:schemaRef ds:uri="75bf9804-c18d-470a-a27f-eeaf4abcd247"/>
-  </ds:schemaRefs>
-</ds:datastoreItem>
-</file>
-
-<file path=customXml/itemProps4.xml><?xml version="1.0" encoding="utf-8"?>
-<ds:datastoreItem xmlns:ds="http://schemas.openxmlformats.org/officeDocument/2006/customXml" ds:itemID="{B65DD72E-8E1F-472F-9954-9E676E0CBAE9}">
-  <ds:schemaRefs>
-    <ds:schemaRef ds:uri="http://schemas.openxmlformats.org/officeDocument/2006/bibliography"/>
+    <ds:schemaRef ds:uri="http://schemas.microsoft.com/sharepoint/v3/contenttype/forms"/>
   </ds:schemaRefs>
 </ds:datastoreItem>
 </file>
</xml_diff>